<commit_message>
Cập nhật báo cáo: thông tin SV/GVHD, trường Kỹ thuật và Công nghệ, ảnh giao diện thật
Co-Authored-By: Claude Sonnet 5.5 <noreply@anthropic.com>
Claude-Session: https://claude.ai/code/session_01RARcUUxZEgHfmQTRmBp5rY
</commit_message>
<xml_diff>
--- a/docs/BaoCao_DoAn_InternTrack.docx
+++ b/docs/BaoCao_DoAn_InternTrack.docx
@@ -15,7 +15,7 @@
           <w:i w:val="false"/>
           <w:sz w:val="28"/>
         </w:rPr>
-        <w:t>TRƯỜNG ĐẠI HỌC VINH</w:t>
+        <w:t>ĐẠI HỌC VINH</w:t>
       </w:r>
     </w:p>
     <w:p>
@@ -31,7 +31,7 @@
           <w:i w:val="false"/>
           <w:sz w:val="28"/>
         </w:rPr>
-        <w:t>VIỆN KỸ THUẬT VÀ CÔNG NGHỆ</w:t>
+        <w:t>TRƯỜNG KỸ THUẬT VÀ CÔNG NGHỆ</w:t>
       </w:r>
     </w:p>
     <w:p>
@@ -191,7 +191,7 @@
             </w:pPr>
             <w:r>
               <w:rPr/>
-              <w:t>[Học hàm, học vị. Họ tên giảng viên hướng dẫn]</w:t>
+              <w:t>TS. Cao Thanh Sơn</w:t>
             </w:r>
           </w:p>
         </w:tc>
@@ -229,7 +229,7 @@
             </w:pPr>
             <w:r>
               <w:rPr/>
-              <w:t>[Họ và tên sinh viên], [Mã số sinh viên]</w:t>
+              <w:t>Trần Minh Hoàng, 235748020110017</w:t>
             </w:r>
           </w:p>
         </w:tc>
@@ -269,7 +269,7 @@
         <w:pStyle w:val="Heading1"/>
         <w:rPr/>
       </w:pPr>
-      <w:bookmarkStart w:id="0" w:name="__RefHeading___Toc1389_2949742311"/>
+      <w:bookmarkStart w:id="0" w:name="__RefHeading___Toc1309_2376024671"/>
       <w:bookmarkEnd w:id="0"/>
       <w:r>
         <w:rPr/>
@@ -289,7 +289,7 @@
           <w:b w:val="false"/>
           <w:i w:val="false"/>
         </w:rPr>
-        <w:t>Trong suốt quá trình học tập và rèn luyện tại Viện Kỹ thuật và Công nghệ - Trường Đại học Vinh, em đã được quý thầy cô truyền dạy nhiều kiến thức quý báu. Đồ án chuyên ngành với đề tài “Xây dựng hệ thống quản lý và theo dõi kỳ thực tập tích hợp trí tuệ nhân tạo (InternTrack)” là kết quả của quá trình học tập và nỗ lực không ngừng đó.</w:t>
+        <w:t>Trong suốt quá trình học tập và rèn luyện tại Trường Kỹ thuật và Công nghệ - Đại học Vinh, em đã được quý thầy cô truyền dạy nhiều kiến thức quý báu. Đồ án chuyên ngành với đề tài “Xây dựng hệ thống quản lý và theo dõi kỳ thực tập tích hợp trí tuệ nhân tạo (InternTrack)” là kết quả của quá trình học tập và nỗ lực không ngừng đó.</w:t>
       </w:r>
     </w:p>
     <w:p>
@@ -305,7 +305,7 @@
           <w:b w:val="false"/>
           <w:i w:val="false"/>
         </w:rPr>
-        <w:t>Lời đầu tiên, em xin gửi lời cảm ơn chân thành và sâu sắc nhất tới thầy/cô [Học hàm, học vị. Họ tên giảng viên hướng dẫn]. Trong suốt quá trình thực hiện đồ án, thầy/cô đã luôn quan tâm, tận tình hướng dẫn và định hướng cho em về mặt kỹ thuật cũng như tư duy giải quyết vấn đề. Những góp ý chuyên môn và sự khích lệ kịp thời của thầy/cô là động lực lớn để em hoàn thiện đề tài.</w:t>
+        <w:t>Lời đầu tiên, em xin gửi lời cảm ơn chân thành và sâu sắc nhất tới thầy TS. Cao Thanh Sơn. Trong suốt quá trình thực hiện đồ án, thầy đã luôn quan tâm, tận tình hướng dẫn và định hướng cho em về mặt kỹ thuật cũng như tư duy giải quyết vấn đề. Những góp ý chuyên môn và sự khích lệ kịp thời của thầy là động lực lớn để em hoàn thiện đề tài.</w:t>
       </w:r>
     </w:p>
     <w:p>
@@ -321,7 +321,7 @@
           <w:b w:val="false"/>
           <w:i w:val="false"/>
         </w:rPr>
-        <w:t>Em cũng xin bày tỏ lòng biết ơn tới toàn thể quý thầy cô trong Viện Kỹ thuật và Công nghệ. Sự tận tâm giảng dạy và những kiến thức nền tảng mà thầy cô truyền đạt trong suốt thời gian học tập chính là hành trang quan trọng để em tự tin triển khai đề tài này.</w:t>
+        <w:t>Em cũng xin bày tỏ lòng biết ơn tới toàn thể quý thầy cô trong Trường Kỹ thuật và Công nghệ. Sự tận tâm giảng dạy và những kiến thức nền tảng mà thầy cô truyền đạt trong suốt thời gian học tập chính là hành trang quan trọng để em tự tin triển khai đề tài này.</w:t>
       </w:r>
     </w:p>
     <w:p>
@@ -394,7 +394,7 @@
         <w:pStyle w:val="Heading1"/>
         <w:rPr/>
       </w:pPr>
-      <w:bookmarkStart w:id="1" w:name="__RefHeading___Toc1391_2949742311"/>
+      <w:bookmarkStart w:id="1" w:name="__RefHeading___Toc1311_2376024671"/>
       <w:bookmarkEnd w:id="1"/>
       <w:r>
         <w:rPr/>
@@ -435,7 +435,7 @@
             </w:rPr>
             <w:fldChar w:fldCharType="separate"/>
           </w:r>
-          <w:hyperlink w:anchor="__RefHeading___Toc1389_2949742311">
+          <w:hyperlink w:anchor="__RefHeading___Toc1309_2376024671">
             <w:r>
               <w:rPr>
                 <w:webHidden/>
@@ -456,7 +456,7 @@
             </w:tabs>
             <w:rPr/>
           </w:pPr>
-          <w:hyperlink w:anchor="__RefHeading___Toc1391_2949742311">
+          <w:hyperlink w:anchor="__RefHeading___Toc1311_2376024671">
             <w:r>
               <w:rPr>
                 <w:webHidden/>
@@ -477,7 +477,7 @@
             </w:tabs>
             <w:rPr/>
           </w:pPr>
-          <w:hyperlink w:anchor="__RefHeading___Toc1393_2949742311">
+          <w:hyperlink w:anchor="__RefHeading___Toc1313_2376024671">
             <w:r>
               <w:rPr>
                 <w:webHidden/>
@@ -498,7 +498,7 @@
             </w:tabs>
             <w:rPr/>
           </w:pPr>
-          <w:hyperlink w:anchor="__RefHeading___Toc1395_2949742311">
+          <w:hyperlink w:anchor="__RefHeading___Toc1315_2376024671">
             <w:r>
               <w:rPr>
                 <w:webHidden/>
@@ -519,7 +519,7 @@
             </w:tabs>
             <w:rPr/>
           </w:pPr>
-          <w:hyperlink w:anchor="__RefHeading___Toc1397_2949742311">
+          <w:hyperlink w:anchor="__RefHeading___Toc1317_2376024671">
             <w:r>
               <w:rPr>
                 <w:webHidden/>
@@ -540,7 +540,7 @@
             </w:tabs>
             <w:rPr/>
           </w:pPr>
-          <w:hyperlink w:anchor="__RefHeading___Toc1399_2949742311">
+          <w:hyperlink w:anchor="__RefHeading___Toc1319_2376024671">
             <w:r>
               <w:rPr>
                 <w:webHidden/>
@@ -561,7 +561,7 @@
             </w:tabs>
             <w:rPr/>
           </w:pPr>
-          <w:hyperlink w:anchor="__RefHeading___Toc1401_2949742311">
+          <w:hyperlink w:anchor="__RefHeading___Toc1321_2376024671">
             <w:r>
               <w:rPr>
                 <w:webHidden/>
@@ -582,7 +582,7 @@
             </w:tabs>
             <w:rPr/>
           </w:pPr>
-          <w:hyperlink w:anchor="__RefHeading___Toc1403_2949742311">
+          <w:hyperlink w:anchor="__RefHeading___Toc1323_2376024671">
             <w:r>
               <w:rPr>
                 <w:webHidden/>
@@ -603,7 +603,7 @@
             </w:tabs>
             <w:rPr/>
           </w:pPr>
-          <w:hyperlink w:anchor="__RefHeading___Toc1405_2949742311">
+          <w:hyperlink w:anchor="__RefHeading___Toc1325_2376024671">
             <w:r>
               <w:rPr>
                 <w:webHidden/>
@@ -624,7 +624,7 @@
             </w:tabs>
             <w:rPr/>
           </w:pPr>
-          <w:hyperlink w:anchor="__RefHeading___Toc1407_2949742311">
+          <w:hyperlink w:anchor="__RefHeading___Toc1327_2376024671">
             <w:r>
               <w:rPr>
                 <w:webHidden/>
@@ -645,7 +645,7 @@
             </w:tabs>
             <w:rPr/>
           </w:pPr>
-          <w:hyperlink w:anchor="__RefHeading___Toc1409_2949742311">
+          <w:hyperlink w:anchor="__RefHeading___Toc1329_2376024671">
             <w:r>
               <w:rPr>
                 <w:webHidden/>
@@ -666,7 +666,7 @@
             </w:tabs>
             <w:rPr/>
           </w:pPr>
-          <w:hyperlink w:anchor="__RefHeading___Toc1411_2949742311">
+          <w:hyperlink w:anchor="__RefHeading___Toc1331_2376024671">
             <w:r>
               <w:rPr>
                 <w:webHidden/>
@@ -687,7 +687,7 @@
             </w:tabs>
             <w:rPr/>
           </w:pPr>
-          <w:hyperlink w:anchor="__RefHeading___Toc1413_2949742311">
+          <w:hyperlink w:anchor="__RefHeading___Toc1333_2376024671">
             <w:r>
               <w:rPr>
                 <w:webHidden/>
@@ -708,7 +708,7 @@
             </w:tabs>
             <w:rPr/>
           </w:pPr>
-          <w:hyperlink w:anchor="__RefHeading___Toc1415_2949742311">
+          <w:hyperlink w:anchor="__RefHeading___Toc1335_2376024671">
             <w:r>
               <w:rPr>
                 <w:webHidden/>
@@ -729,7 +729,7 @@
             </w:tabs>
             <w:rPr/>
           </w:pPr>
-          <w:hyperlink w:anchor="__RefHeading___Toc1417_2949742311">
+          <w:hyperlink w:anchor="__RefHeading___Toc1337_2376024671">
             <w:r>
               <w:rPr>
                 <w:webHidden/>
@@ -750,7 +750,7 @@
             </w:tabs>
             <w:rPr/>
           </w:pPr>
-          <w:hyperlink w:anchor="__RefHeading___Toc1419_2949742311">
+          <w:hyperlink w:anchor="__RefHeading___Toc1339_2376024671">
             <w:r>
               <w:rPr>
                 <w:webHidden/>
@@ -771,7 +771,7 @@
             </w:tabs>
             <w:rPr/>
           </w:pPr>
-          <w:hyperlink w:anchor="__RefHeading___Toc1421_2949742311">
+          <w:hyperlink w:anchor="__RefHeading___Toc1341_2376024671">
             <w:r>
               <w:rPr>
                 <w:webHidden/>
@@ -792,7 +792,7 @@
             </w:tabs>
             <w:rPr/>
           </w:pPr>
-          <w:hyperlink w:anchor="__RefHeading___Toc1423_2949742311">
+          <w:hyperlink w:anchor="__RefHeading___Toc1343_2376024671">
             <w:r>
               <w:rPr>
                 <w:webHidden/>
@@ -813,7 +813,7 @@
             </w:tabs>
             <w:rPr/>
           </w:pPr>
-          <w:hyperlink w:anchor="__RefHeading___Toc1425_2949742311">
+          <w:hyperlink w:anchor="__RefHeading___Toc1345_2376024671">
             <w:r>
               <w:rPr>
                 <w:webHidden/>
@@ -834,7 +834,7 @@
             </w:tabs>
             <w:rPr/>
           </w:pPr>
-          <w:hyperlink w:anchor="__RefHeading___Toc1427_2949742311">
+          <w:hyperlink w:anchor="__RefHeading___Toc1347_2376024671">
             <w:r>
               <w:rPr>
                 <w:webHidden/>
@@ -855,7 +855,7 @@
             </w:tabs>
             <w:rPr/>
           </w:pPr>
-          <w:hyperlink w:anchor="__RefHeading___Toc1429_2949742311">
+          <w:hyperlink w:anchor="__RefHeading___Toc1349_2376024671">
             <w:r>
               <w:rPr>
                 <w:webHidden/>
@@ -876,7 +876,7 @@
             </w:tabs>
             <w:rPr/>
           </w:pPr>
-          <w:hyperlink w:anchor="__RefHeading___Toc1431_2949742311">
+          <w:hyperlink w:anchor="__RefHeading___Toc1351_2376024671">
             <w:r>
               <w:rPr>
                 <w:webHidden/>
@@ -897,7 +897,7 @@
             </w:tabs>
             <w:rPr/>
           </w:pPr>
-          <w:hyperlink w:anchor="__RefHeading___Toc1433_2949742311">
+          <w:hyperlink w:anchor="__RefHeading___Toc1353_2376024671">
             <w:r>
               <w:rPr>
                 <w:webHidden/>
@@ -918,7 +918,7 @@
             </w:tabs>
             <w:rPr/>
           </w:pPr>
-          <w:hyperlink w:anchor="__RefHeading___Toc1435_2949742311">
+          <w:hyperlink w:anchor="__RefHeading___Toc1355_2376024671">
             <w:r>
               <w:rPr>
                 <w:webHidden/>
@@ -939,7 +939,7 @@
             </w:tabs>
             <w:rPr/>
           </w:pPr>
-          <w:hyperlink w:anchor="__RefHeading___Toc1437_2949742311">
+          <w:hyperlink w:anchor="__RefHeading___Toc1357_2376024671">
             <w:r>
               <w:rPr>
                 <w:webHidden/>
@@ -960,7 +960,7 @@
             </w:tabs>
             <w:rPr/>
           </w:pPr>
-          <w:hyperlink w:anchor="__RefHeading___Toc1439_2949742311">
+          <w:hyperlink w:anchor="__RefHeading___Toc1359_2376024671">
             <w:r>
               <w:rPr>
                 <w:webHidden/>
@@ -981,7 +981,7 @@
             </w:tabs>
             <w:rPr/>
           </w:pPr>
-          <w:hyperlink w:anchor="__RefHeading___Toc1441_2949742311">
+          <w:hyperlink w:anchor="__RefHeading___Toc1361_2376024671">
             <w:r>
               <w:rPr>
                 <w:webHidden/>
@@ -1002,7 +1002,7 @@
             </w:tabs>
             <w:rPr/>
           </w:pPr>
-          <w:hyperlink w:anchor="__RefHeading___Toc1443_2949742311">
+          <w:hyperlink w:anchor="__RefHeading___Toc1363_2376024671">
             <w:r>
               <w:rPr>
                 <w:webHidden/>
@@ -1023,7 +1023,7 @@
             </w:tabs>
             <w:rPr/>
           </w:pPr>
-          <w:hyperlink w:anchor="__RefHeading___Toc1445_2949742311">
+          <w:hyperlink w:anchor="__RefHeading___Toc1365_2376024671">
             <w:r>
               <w:rPr>
                 <w:webHidden/>
@@ -1044,7 +1044,7 @@
             </w:tabs>
             <w:rPr/>
           </w:pPr>
-          <w:hyperlink w:anchor="__RefHeading___Toc1447_2949742311">
+          <w:hyperlink w:anchor="__RefHeading___Toc1367_2376024671">
             <w:r>
               <w:rPr>
                 <w:webHidden/>
@@ -1065,7 +1065,7 @@
             </w:tabs>
             <w:rPr/>
           </w:pPr>
-          <w:hyperlink w:anchor="__RefHeading___Toc1449_2949742311">
+          <w:hyperlink w:anchor="__RefHeading___Toc1369_2376024671">
             <w:r>
               <w:rPr>
                 <w:webHidden/>
@@ -1086,7 +1086,7 @@
             </w:tabs>
             <w:rPr/>
           </w:pPr>
-          <w:hyperlink w:anchor="__RefHeading___Toc1451_2949742311">
+          <w:hyperlink w:anchor="__RefHeading___Toc1371_2376024671">
             <w:r>
               <w:rPr>
                 <w:webHidden/>
@@ -1107,7 +1107,7 @@
             </w:tabs>
             <w:rPr/>
           </w:pPr>
-          <w:hyperlink w:anchor="__RefHeading___Toc1453_2949742311">
+          <w:hyperlink w:anchor="__RefHeading___Toc1373_2376024671">
             <w:r>
               <w:rPr>
                 <w:webHidden/>
@@ -1128,7 +1128,7 @@
             </w:tabs>
             <w:rPr/>
           </w:pPr>
-          <w:hyperlink w:anchor="__RefHeading___Toc1455_2949742311">
+          <w:hyperlink w:anchor="__RefHeading___Toc1375_2376024671">
             <w:r>
               <w:rPr>
                 <w:webHidden/>
@@ -1149,7 +1149,7 @@
             </w:tabs>
             <w:rPr/>
           </w:pPr>
-          <w:hyperlink w:anchor="__RefHeading___Toc1457_2949742311">
+          <w:hyperlink w:anchor="__RefHeading___Toc1377_2376024671">
             <w:r>
               <w:rPr>
                 <w:webHidden/>
@@ -1170,7 +1170,7 @@
             </w:tabs>
             <w:rPr/>
           </w:pPr>
-          <w:hyperlink w:anchor="__RefHeading___Toc1459_2949742311">
+          <w:hyperlink w:anchor="__RefHeading___Toc1379_2376024671">
             <w:r>
               <w:rPr>
                 <w:webHidden/>
@@ -1191,7 +1191,7 @@
             </w:tabs>
             <w:rPr/>
           </w:pPr>
-          <w:hyperlink w:anchor="__RefHeading___Toc1461_2949742311">
+          <w:hyperlink w:anchor="__RefHeading___Toc1381_2376024671">
             <w:r>
               <w:rPr>
                 <w:webHidden/>
@@ -1212,7 +1212,7 @@
             </w:tabs>
             <w:rPr/>
           </w:pPr>
-          <w:hyperlink w:anchor="__RefHeading___Toc1463_2949742311">
+          <w:hyperlink w:anchor="__RefHeading___Toc1383_2376024671">
             <w:r>
               <w:rPr>
                 <w:webHidden/>
@@ -1233,7 +1233,7 @@
             </w:tabs>
             <w:rPr/>
           </w:pPr>
-          <w:hyperlink w:anchor="__RefHeading___Toc1465_2949742311">
+          <w:hyperlink w:anchor="__RefHeading___Toc1385_2376024671">
             <w:r>
               <w:rPr>
                 <w:webHidden/>
@@ -1241,7 +1241,7 @@
               </w:rPr>
               <w:t>3.4.2. Giao diện dành cho sinh viên</w:t>
               <w:tab/>
-              <w:t>22</w:t>
+              <w:t>23</w:t>
             </w:r>
           </w:hyperlink>
         </w:p>
@@ -1254,7 +1254,7 @@
             </w:tabs>
             <w:rPr/>
           </w:pPr>
-          <w:hyperlink w:anchor="__RefHeading___Toc1467_2949742311">
+          <w:hyperlink w:anchor="__RefHeading___Toc1387_2376024671">
             <w:r>
               <w:rPr>
                 <w:webHidden/>
@@ -1262,7 +1262,7 @@
               </w:rPr>
               <w:t>3.4.3. Giao diện dành cho doanh nghiệp</w:t>
               <w:tab/>
-              <w:t>24</w:t>
+              <w:t>25</w:t>
             </w:r>
           </w:hyperlink>
         </w:p>
@@ -1275,7 +1275,7 @@
             </w:tabs>
             <w:rPr/>
           </w:pPr>
-          <w:hyperlink w:anchor="__RefHeading___Toc1469_2949742311">
+          <w:hyperlink w:anchor="__RefHeading___Toc1389_2376024671">
             <w:r>
               <w:rPr>
                 <w:webHidden/>
@@ -1283,7 +1283,7 @@
               </w:rPr>
               <w:t>3.4.4. Giao diện dành cho giảng viên</w:t>
               <w:tab/>
-              <w:t>25</w:t>
+              <w:t>26</w:t>
             </w:r>
           </w:hyperlink>
         </w:p>
@@ -1296,7 +1296,7 @@
             </w:tabs>
             <w:rPr/>
           </w:pPr>
-          <w:hyperlink w:anchor="__RefHeading___Toc1471_2949742311">
+          <w:hyperlink w:anchor="__RefHeading___Toc1391_2376024671">
             <w:r>
               <w:rPr>
                 <w:webHidden/>
@@ -1304,7 +1304,7 @@
               </w:rPr>
               <w:t>3.4.5. Giao diện dành cho quản trị viên</w:t>
               <w:tab/>
-              <w:t>26</w:t>
+              <w:t>28</w:t>
             </w:r>
           </w:hyperlink>
         </w:p>
@@ -1317,7 +1317,7 @@
             </w:tabs>
             <w:rPr/>
           </w:pPr>
-          <w:hyperlink w:anchor="__RefHeading___Toc1473_2949742311">
+          <w:hyperlink w:anchor="__RefHeading___Toc1393_2376024671">
             <w:r>
               <w:rPr>
                 <w:webHidden/>
@@ -1325,7 +1325,7 @@
               </w:rPr>
               <w:t>KẾT LUẬN</w:t>
               <w:tab/>
-              <w:t>28</w:t>
+              <w:t>30</w:t>
             </w:r>
           </w:hyperlink>
         </w:p>
@@ -1338,7 +1338,7 @@
             </w:tabs>
             <w:rPr/>
           </w:pPr>
-          <w:hyperlink w:anchor="__RefHeading___Toc1475_2949742311">
+          <w:hyperlink w:anchor="__RefHeading___Toc1395_2376024671">
             <w:r>
               <w:rPr>
                 <w:webHidden/>
@@ -1346,7 +1346,7 @@
               </w:rPr>
               <w:t>1. Kết quả đạt được</w:t>
               <w:tab/>
-              <w:t>28</w:t>
+              <w:t>30</w:t>
             </w:r>
           </w:hyperlink>
         </w:p>
@@ -1359,7 +1359,7 @@
             </w:tabs>
             <w:rPr/>
           </w:pPr>
-          <w:hyperlink w:anchor="__RefHeading___Toc1477_2949742311">
+          <w:hyperlink w:anchor="__RefHeading___Toc1397_2376024671">
             <w:r>
               <w:rPr>
                 <w:webHidden/>
@@ -1367,7 +1367,7 @@
               </w:rPr>
               <w:t>2. Hạn chế</w:t>
               <w:tab/>
-              <w:t>28</w:t>
+              <w:t>30</w:t>
             </w:r>
           </w:hyperlink>
         </w:p>
@@ -1380,7 +1380,7 @@
             </w:tabs>
             <w:rPr/>
           </w:pPr>
-          <w:hyperlink w:anchor="__RefHeading___Toc1479_2949742311">
+          <w:hyperlink w:anchor="__RefHeading___Toc1399_2376024671">
             <w:r>
               <w:rPr>
                 <w:webHidden/>
@@ -1388,7 +1388,7 @@
               </w:rPr>
               <w:t>3. Hướng phát triển</w:t>
               <w:tab/>
-              <w:t>28</w:t>
+              <w:t>30</w:t>
             </w:r>
           </w:hyperlink>
         </w:p>
@@ -1401,7 +1401,7 @@
             </w:tabs>
             <w:rPr/>
           </w:pPr>
-          <w:hyperlink w:anchor="__RefHeading___Toc1481_2949742311">
+          <w:hyperlink w:anchor="__RefHeading___Toc1401_2376024671">
             <w:r>
               <w:rPr>
                 <w:webHidden/>
@@ -1409,7 +1409,7 @@
               </w:rPr>
               <w:t>TÀI LIỆU THAM KHẢO</w:t>
               <w:tab/>
-              <w:t>29</w:t>
+              <w:t>31</w:t>
             </w:r>
           </w:hyperlink>
           <w:r>
@@ -1429,7 +1429,7 @@
       <w:r>
         <w:br w:type="page"/>
       </w:r>
-      <w:bookmarkStart w:id="2" w:name="__RefHeading___Toc1393_2949742311"/>
+      <w:bookmarkStart w:id="2" w:name="__RefHeading___Toc1313_2376024671"/>
       <w:bookmarkEnd w:id="2"/>
       <w:r>
         <w:rPr/>
@@ -1472,7 +1472,7 @@
             </w:rPr>
             <w:fldChar w:fldCharType="separate"/>
           </w:r>
-          <w:hyperlink w:anchor="__RefHeading___Toc1483_2949742311">
+          <w:hyperlink w:anchor="__RefHeading___Toc1403_2376024671">
             <w:r>
               <w:rPr>
                 <w:webHidden/>
@@ -1499,7 +1499,7 @@
             </w:tabs>
             <w:rPr/>
           </w:pPr>
-          <w:hyperlink w:anchor="__RefHeading___Toc1539_2949742311">
+          <w:hyperlink w:anchor="__RefHeading___Toc1459_2376024671">
             <w:r>
               <w:rPr>
                 <w:webHidden/>
@@ -1526,7 +1526,7 @@
             </w:tabs>
             <w:rPr/>
           </w:pPr>
-          <w:hyperlink w:anchor="__RefHeading___Toc1537_2949742311">
+          <w:hyperlink w:anchor="__RefHeading___Toc1457_2376024671">
             <w:r>
               <w:rPr>
                 <w:webHidden/>
@@ -1553,7 +1553,7 @@
             </w:tabs>
             <w:rPr/>
           </w:pPr>
-          <w:hyperlink w:anchor="__RefHeading___Toc1535_2949742311">
+          <w:hyperlink w:anchor="__RefHeading___Toc1455_2376024671">
             <w:r>
               <w:rPr>
                 <w:webHidden/>
@@ -1580,7 +1580,7 @@
             </w:tabs>
             <w:rPr/>
           </w:pPr>
-          <w:hyperlink w:anchor="__RefHeading___Toc1533_2949742311">
+          <w:hyperlink w:anchor="__RefHeading___Toc1453_2376024671">
             <w:r>
               <w:rPr>
                 <w:webHidden/>
@@ -1607,7 +1607,7 @@
             </w:tabs>
             <w:rPr/>
           </w:pPr>
-          <w:hyperlink w:anchor="__RefHeading___Toc1531_2949742311">
+          <w:hyperlink w:anchor="__RefHeading___Toc1451_2376024671">
             <w:r>
               <w:rPr>
                 <w:webHidden/>
@@ -1634,7 +1634,7 @@
             </w:tabs>
             <w:rPr/>
           </w:pPr>
-          <w:hyperlink w:anchor="__RefHeading___Toc1529_2949742311">
+          <w:hyperlink w:anchor="__RefHeading___Toc1449_2376024671">
             <w:r>
               <w:rPr>
                 <w:webHidden/>
@@ -1661,7 +1661,7 @@
             </w:tabs>
             <w:rPr/>
           </w:pPr>
-          <w:hyperlink w:anchor="__RefHeading___Toc1527_2949742311">
+          <w:hyperlink w:anchor="__RefHeading___Toc1447_2376024671">
             <w:r>
               <w:rPr>
                 <w:webHidden/>
@@ -1688,7 +1688,7 @@
             </w:tabs>
             <w:rPr/>
           </w:pPr>
-          <w:hyperlink w:anchor="__RefHeading___Toc1525_2949742311">
+          <w:hyperlink w:anchor="__RefHeading___Toc1445_2376024671">
             <w:r>
               <w:rPr>
                 <w:webHidden/>
@@ -1715,7 +1715,7 @@
             </w:tabs>
             <w:rPr/>
           </w:pPr>
-          <w:hyperlink w:anchor="__RefHeading___Toc1523_2949742311">
+          <w:hyperlink w:anchor="__RefHeading___Toc1443_2376024671">
             <w:r>
               <w:rPr>
                 <w:webHidden/>
@@ -1742,7 +1742,7 @@
             </w:tabs>
             <w:rPr/>
           </w:pPr>
-          <w:hyperlink w:anchor="__RefHeading___Toc1521_2949742311">
+          <w:hyperlink w:anchor="__RefHeading___Toc1441_2376024671">
             <w:r>
               <w:rPr>
                 <w:webHidden/>
@@ -1769,7 +1769,7 @@
             </w:tabs>
             <w:rPr/>
           </w:pPr>
-          <w:hyperlink w:anchor="__RefHeading___Toc1519_2949742311">
+          <w:hyperlink w:anchor="__RefHeading___Toc1439_2376024671">
             <w:r>
               <w:rPr>
                 <w:webHidden/>
@@ -1796,7 +1796,7 @@
             </w:tabs>
             <w:rPr/>
           </w:pPr>
-          <w:hyperlink w:anchor="__RefHeading___Toc1517_2949742311">
+          <w:hyperlink w:anchor="__RefHeading___Toc1437_2376024671">
             <w:r>
               <w:rPr>
                 <w:webHidden/>
@@ -1823,7 +1823,7 @@
             </w:tabs>
             <w:rPr/>
           </w:pPr>
-          <w:hyperlink w:anchor="__RefHeading___Toc1515_2949742311">
+          <w:hyperlink w:anchor="__RefHeading___Toc1435_2376024671">
             <w:r>
               <w:rPr>
                 <w:webHidden/>
@@ -1850,14 +1850,14 @@
             </w:tabs>
             <w:rPr/>
           </w:pPr>
-          <w:hyperlink w:anchor="__RefHeading___Toc1513_2949742311">
+          <w:hyperlink w:anchor="__RefHeading___Toc1433_2376024671">
             <w:r>
               <w:rPr>
                 <w:webHidden/>
                 <w:rStyle w:val="IndexLink"/>
                 <w:i w:val="false"/>
               </w:rPr>
-              <w:t>Hình 3.2. Giao diện quên mật khẩu và nhập OTP</w:t>
+              <w:t>Hình 3.2. Giao diện quên mật khẩu</w:t>
             </w:r>
             <w:r>
               <w:rPr>
@@ -1877,7 +1877,7 @@
             </w:tabs>
             <w:rPr/>
           </w:pPr>
-          <w:hyperlink w:anchor="__RefHeading___Toc1511_2949742311">
+          <w:hyperlink w:anchor="__RefHeading___Toc1431_2376024671">
             <w:r>
               <w:rPr>
                 <w:webHidden/>
@@ -1891,7 +1891,7 @@
                 <w:rStyle w:val="IndexLink"/>
               </w:rPr>
               <w:tab/>
-              <w:t>22</w:t>
+              <w:t>23</w:t>
             </w:r>
           </w:hyperlink>
         </w:p>
@@ -1904,7 +1904,7 @@
             </w:tabs>
             <w:rPr/>
           </w:pPr>
-          <w:hyperlink w:anchor="__RefHeading___Toc1509_2949742311">
+          <w:hyperlink w:anchor="__RefHeading___Toc1429_2376024671">
             <w:r>
               <w:rPr>
                 <w:webHidden/>
@@ -1931,7 +1931,7 @@
             </w:tabs>
             <w:rPr/>
           </w:pPr>
-          <w:hyperlink w:anchor="__RefHeading___Toc1507_2949742311">
+          <w:hyperlink w:anchor="__RefHeading___Toc1427_2376024671">
             <w:r>
               <w:rPr>
                 <w:webHidden/>
@@ -1945,7 +1945,7 @@
                 <w:rStyle w:val="IndexLink"/>
               </w:rPr>
               <w:tab/>
-              <w:t>23</w:t>
+              <w:t>24</w:t>
             </w:r>
           </w:hyperlink>
         </w:p>
@@ -1958,7 +1958,7 @@
             </w:tabs>
             <w:rPr/>
           </w:pPr>
-          <w:hyperlink w:anchor="__RefHeading___Toc1505_2949742311">
+          <w:hyperlink w:anchor="__RefHeading___Toc1425_2376024671">
             <w:r>
               <w:rPr>
                 <w:webHidden/>
@@ -1972,7 +1972,7 @@
                 <w:rStyle w:val="IndexLink"/>
               </w:rPr>
               <w:tab/>
-              <w:t>23</w:t>
+              <w:t>24</w:t>
             </w:r>
           </w:hyperlink>
         </w:p>
@@ -1985,7 +1985,7 @@
             </w:tabs>
             <w:rPr/>
           </w:pPr>
-          <w:hyperlink w:anchor="__RefHeading___Toc1503_2949742311">
+          <w:hyperlink w:anchor="__RefHeading___Toc1423_2376024671">
             <w:r>
               <w:rPr>
                 <w:webHidden/>
@@ -1999,7 +1999,7 @@
                 <w:rStyle w:val="IndexLink"/>
               </w:rPr>
               <w:tab/>
-              <w:t>24</w:t>
+              <w:t>25</w:t>
             </w:r>
           </w:hyperlink>
         </w:p>
@@ -2012,7 +2012,7 @@
             </w:tabs>
             <w:rPr/>
           </w:pPr>
-          <w:hyperlink w:anchor="__RefHeading___Toc1501_2949742311">
+          <w:hyperlink w:anchor="__RefHeading___Toc1421_2376024671">
             <w:r>
               <w:rPr>
                 <w:webHidden/>
@@ -2026,7 +2026,7 @@
                 <w:rStyle w:val="IndexLink"/>
               </w:rPr>
               <w:tab/>
-              <w:t>24</w:t>
+              <w:t>25</w:t>
             </w:r>
           </w:hyperlink>
         </w:p>
@@ -2039,21 +2039,21 @@
             </w:tabs>
             <w:rPr/>
           </w:pPr>
-          <w:hyperlink w:anchor="__RefHeading___Toc1499_2949742311">
+          <w:hyperlink w:anchor="__RefHeading___Toc1419_2376024671">
             <w:r>
               <w:rPr>
                 <w:webHidden/>
                 <w:rStyle w:val="IndexLink"/>
                 <w:i w:val="false"/>
               </w:rPr>
-              <w:t>Hình 3.9. Giao diện đánh giá và kỹ năng thực tập</w:t>
+              <w:t>Hình 3.9. Giao diện đánh giá năng lực thực tập sinh</w:t>
             </w:r>
             <w:r>
               <w:rPr>
                 <w:rStyle w:val="IndexLink"/>
               </w:rPr>
               <w:tab/>
-              <w:t>24</w:t>
+              <w:t>26</w:t>
             </w:r>
           </w:hyperlink>
         </w:p>
@@ -2066,7 +2066,7 @@
             </w:tabs>
             <w:rPr/>
           </w:pPr>
-          <w:hyperlink w:anchor="__RefHeading___Toc1497_2949742311">
+          <w:hyperlink w:anchor="__RefHeading___Toc1417_2376024671">
             <w:r>
               <w:rPr>
                 <w:webHidden/>
@@ -2080,7 +2080,7 @@
                 <w:rStyle w:val="IndexLink"/>
               </w:rPr>
               <w:tab/>
-              <w:t>25</w:t>
+              <w:t>26</w:t>
             </w:r>
           </w:hyperlink>
         </w:p>
@@ -2093,7 +2093,7 @@
             </w:tabs>
             <w:rPr/>
           </w:pPr>
-          <w:hyperlink w:anchor="__RefHeading___Toc1495_2949742311">
+          <w:hyperlink w:anchor="__RefHeading___Toc1415_2376024671">
             <w:r>
               <w:rPr>
                 <w:webHidden/>
@@ -2107,7 +2107,7 @@
                 <w:rStyle w:val="IndexLink"/>
               </w:rPr>
               <w:tab/>
-              <w:t>25</w:t>
+              <w:t>27</w:t>
             </w:r>
           </w:hyperlink>
         </w:p>
@@ -2120,7 +2120,7 @@
             </w:tabs>
             <w:rPr/>
           </w:pPr>
-          <w:hyperlink w:anchor="__RefHeading___Toc1493_2949742311">
+          <w:hyperlink w:anchor="__RefHeading___Toc1413_2376024671">
             <w:r>
               <w:rPr>
                 <w:webHidden/>
@@ -2134,7 +2134,7 @@
                 <w:rStyle w:val="IndexLink"/>
               </w:rPr>
               <w:tab/>
-              <w:t>25</w:t>
+              <w:t>27</w:t>
             </w:r>
           </w:hyperlink>
         </w:p>
@@ -2147,7 +2147,7 @@
             </w:tabs>
             <w:rPr/>
           </w:pPr>
-          <w:hyperlink w:anchor="__RefHeading___Toc1491_2949742311">
+          <w:hyperlink w:anchor="__RefHeading___Toc1411_2376024671">
             <w:r>
               <w:rPr>
                 <w:webHidden/>
@@ -2161,7 +2161,7 @@
                 <w:rStyle w:val="IndexLink"/>
               </w:rPr>
               <w:tab/>
-              <w:t>26</w:t>
+              <w:t>28</w:t>
             </w:r>
           </w:hyperlink>
         </w:p>
@@ -2174,7 +2174,7 @@
             </w:tabs>
             <w:rPr/>
           </w:pPr>
-          <w:hyperlink w:anchor="__RefHeading___Toc1489_2949742311">
+          <w:hyperlink w:anchor="__RefHeading___Toc1409_2376024671">
             <w:r>
               <w:rPr>
                 <w:webHidden/>
@@ -2188,7 +2188,7 @@
                 <w:rStyle w:val="IndexLink"/>
               </w:rPr>
               <w:tab/>
-              <w:t>26</w:t>
+              <w:t>28</w:t>
             </w:r>
           </w:hyperlink>
         </w:p>
@@ -2201,7 +2201,7 @@
             </w:tabs>
             <w:rPr/>
           </w:pPr>
-          <w:hyperlink w:anchor="__RefHeading___Toc1487_2949742311">
+          <w:hyperlink w:anchor="__RefHeading___Toc1407_2376024671">
             <w:r>
               <w:rPr>
                 <w:webHidden/>
@@ -2215,7 +2215,7 @@
                 <w:rStyle w:val="IndexLink"/>
               </w:rPr>
               <w:tab/>
-              <w:t>26</w:t>
+              <w:t>29</w:t>
             </w:r>
           </w:hyperlink>
         </w:p>
@@ -2228,7 +2228,7 @@
             </w:tabs>
             <w:rPr/>
           </w:pPr>
-          <w:hyperlink w:anchor="__RefHeading___Toc1485_2949742311">
+          <w:hyperlink w:anchor="__RefHeading___Toc1405_2376024671">
             <w:r>
               <w:rPr>
                 <w:webHidden/>
@@ -2242,7 +2242,7 @@
                 <w:rStyle w:val="IndexLink"/>
               </w:rPr>
               <w:tab/>
-              <w:t>27</w:t>
+              <w:t>29</w:t>
             </w:r>
           </w:hyperlink>
           <w:r>
@@ -2262,7 +2262,7 @@
       <w:r>
         <w:br w:type="page"/>
       </w:r>
-      <w:bookmarkStart w:id="3" w:name="__RefHeading___Toc1395_2949742311"/>
+      <w:bookmarkStart w:id="3" w:name="__RefHeading___Toc1315_2376024671"/>
       <w:bookmarkEnd w:id="3"/>
       <w:r>
         <w:rPr/>
@@ -2306,7 +2306,7 @@
         <w:pStyle w:val="Heading2"/>
         <w:rPr/>
       </w:pPr>
-      <w:bookmarkStart w:id="4" w:name="__RefHeading___Toc1397_2949742311"/>
+      <w:bookmarkStart w:id="4" w:name="__RefHeading___Toc1317_2376024671"/>
       <w:bookmarkEnd w:id="4"/>
       <w:r>
         <w:rPr/>
@@ -2484,7 +2484,7 @@
         <w:pStyle w:val="Heading2"/>
         <w:rPr/>
       </w:pPr>
-      <w:bookmarkStart w:id="5" w:name="__RefHeading___Toc1399_2949742311"/>
+      <w:bookmarkStart w:id="5" w:name="__RefHeading___Toc1319_2376024671"/>
       <w:bookmarkEnd w:id="5"/>
       <w:r>
         <w:rPr/>
@@ -2496,7 +2496,7 @@
         <w:pStyle w:val="Heading3"/>
         <w:rPr/>
       </w:pPr>
-      <w:bookmarkStart w:id="6" w:name="__RefHeading___Toc1401_2949742311"/>
+      <w:bookmarkStart w:id="6" w:name="__RefHeading___Toc1321_2376024671"/>
       <w:bookmarkEnd w:id="6"/>
       <w:r>
         <w:rPr/>
@@ -2709,7 +2709,7 @@
         <w:pStyle w:val="Caption"/>
         <w:rPr/>
       </w:pPr>
-      <w:bookmarkStart w:id="7" w:name="__RefHeading___Toc1483_2949742311"/>
+      <w:bookmarkStart w:id="7" w:name="__RefHeading___Toc1403_2376024671"/>
       <w:bookmarkEnd w:id="7"/>
       <w:r>
         <w:rPr>
@@ -2726,7 +2726,7 @@
         <w:pStyle w:val="Heading3"/>
         <w:rPr/>
       </w:pPr>
-      <w:bookmarkStart w:id="8" w:name="__RefHeading___Toc1403_2949742311"/>
+      <w:bookmarkStart w:id="8" w:name="__RefHeading___Toc1323_2376024671"/>
       <w:bookmarkEnd w:id="8"/>
       <w:r>
         <w:rPr/>
@@ -2858,7 +2858,7 @@
         <w:pStyle w:val="Heading2"/>
         <w:rPr/>
       </w:pPr>
-      <w:bookmarkStart w:id="9" w:name="__RefHeading___Toc1405_2949742311"/>
+      <w:bookmarkStart w:id="9" w:name="__RefHeading___Toc1325_2376024671"/>
       <w:bookmarkEnd w:id="9"/>
       <w:r>
         <w:rPr/>
@@ -2870,7 +2870,7 @@
         <w:pStyle w:val="Heading3"/>
         <w:rPr/>
       </w:pPr>
-      <w:bookmarkStart w:id="10" w:name="__RefHeading___Toc1407_2949742311"/>
+      <w:bookmarkStart w:id="10" w:name="__RefHeading___Toc1327_2376024671"/>
       <w:bookmarkEnd w:id="10"/>
       <w:r>
         <w:rPr/>
@@ -3274,7 +3274,7 @@
         <w:pStyle w:val="Heading3"/>
         <w:rPr/>
       </w:pPr>
-      <w:bookmarkStart w:id="11" w:name="__RefHeading___Toc1409_2949742311"/>
+      <w:bookmarkStart w:id="11" w:name="__RefHeading___Toc1329_2376024671"/>
       <w:bookmarkEnd w:id="11"/>
       <w:r>
         <w:rPr/>
@@ -3436,7 +3436,7 @@
         <w:pStyle w:val="Heading2"/>
         <w:rPr/>
       </w:pPr>
-      <w:bookmarkStart w:id="12" w:name="__RefHeading___Toc1411_2949742311"/>
+      <w:bookmarkStart w:id="12" w:name="__RefHeading___Toc1331_2376024671"/>
       <w:bookmarkEnd w:id="12"/>
       <w:r>
         <w:rPr/>
@@ -3464,7 +3464,7 @@
         <w:pStyle w:val="Heading3"/>
         <w:rPr/>
       </w:pPr>
-      <w:bookmarkStart w:id="13" w:name="__RefHeading___Toc1413_2949742311"/>
+      <w:bookmarkStart w:id="13" w:name="__RefHeading___Toc1333_2376024671"/>
       <w:bookmarkEnd w:id="13"/>
       <w:r>
         <w:rPr/>
@@ -3524,7 +3524,7 @@
         <w:pStyle w:val="Heading3"/>
         <w:rPr/>
       </w:pPr>
-      <w:bookmarkStart w:id="14" w:name="__RefHeading___Toc1415_2949742311"/>
+      <w:bookmarkStart w:id="14" w:name="__RefHeading___Toc1335_2376024671"/>
       <w:bookmarkEnd w:id="14"/>
       <w:r>
         <w:rPr/>
@@ -3584,7 +3584,7 @@
         <w:pStyle w:val="Heading3"/>
         <w:rPr/>
       </w:pPr>
-      <w:bookmarkStart w:id="15" w:name="__RefHeading___Toc1417_2949742311"/>
+      <w:bookmarkStart w:id="15" w:name="__RefHeading___Toc1337_2376024671"/>
       <w:bookmarkEnd w:id="15"/>
       <w:r>
         <w:rPr/>
@@ -3596,7 +3596,7 @@
         <w:pStyle w:val="Caption"/>
         <w:rPr/>
       </w:pPr>
-      <w:bookmarkStart w:id="16" w:name="__RefHeading___Toc1539_2949742311"/>
+      <w:bookmarkStart w:id="16" w:name="__RefHeading___Toc1459_2376024671"/>
       <w:bookmarkEnd w:id="16"/>
       <w:r>
         <w:rPr>
@@ -4409,7 +4409,7 @@
       <w:r>
         <w:br w:type="page"/>
       </w:r>
-      <w:bookmarkStart w:id="17" w:name="__RefHeading___Toc1419_2949742311"/>
+      <w:bookmarkStart w:id="17" w:name="__RefHeading___Toc1339_2376024671"/>
       <w:bookmarkEnd w:id="17"/>
       <w:r>
         <w:rPr/>
@@ -4437,7 +4437,7 @@
         <w:pStyle w:val="Heading2"/>
         <w:rPr/>
       </w:pPr>
-      <w:bookmarkStart w:id="18" w:name="__RefHeading___Toc1421_2949742311"/>
+      <w:bookmarkStart w:id="18" w:name="__RefHeading___Toc1341_2376024671"/>
       <w:bookmarkEnd w:id="18"/>
       <w:r>
         <w:rPr/>
@@ -4449,7 +4449,7 @@
         <w:pStyle w:val="Heading3"/>
         <w:rPr/>
       </w:pPr>
-      <w:bookmarkStart w:id="19" w:name="__RefHeading___Toc1423_2949742311"/>
+      <w:bookmarkStart w:id="19" w:name="__RefHeading___Toc1343_2376024671"/>
       <w:bookmarkEnd w:id="19"/>
       <w:r>
         <w:rPr/>
@@ -4477,7 +4477,7 @@
         <w:pStyle w:val="Caption"/>
         <w:rPr/>
       </w:pPr>
-      <w:bookmarkStart w:id="20" w:name="__RefHeading___Toc1537_2949742311"/>
+      <w:bookmarkStart w:id="20" w:name="__RefHeading___Toc1457_2376024671"/>
       <w:bookmarkEnd w:id="20"/>
       <w:r>
         <w:rPr>
@@ -4985,7 +4985,7 @@
         <w:pStyle w:val="Caption"/>
         <w:rPr/>
       </w:pPr>
-      <w:bookmarkStart w:id="21" w:name="__RefHeading___Toc1535_2949742311"/>
+      <w:bookmarkStart w:id="21" w:name="__RefHeading___Toc1455_2376024671"/>
       <w:bookmarkEnd w:id="21"/>
       <w:r>
         <w:rPr>
@@ -5002,7 +5002,7 @@
         <w:pStyle w:val="Heading3"/>
         <w:rPr/>
       </w:pPr>
-      <w:bookmarkStart w:id="22" w:name="__RefHeading___Toc1425_2949742311"/>
+      <w:bookmarkStart w:id="22" w:name="__RefHeading___Toc1345_2376024671"/>
       <w:bookmarkEnd w:id="22"/>
       <w:r>
         <w:rPr/>
@@ -5030,7 +5030,7 @@
         <w:pStyle w:val="Caption"/>
         <w:rPr/>
       </w:pPr>
-      <w:bookmarkStart w:id="23" w:name="__RefHeading___Toc1533_2949742311"/>
+      <w:bookmarkStart w:id="23" w:name="__RefHeading___Toc1453_2376024671"/>
       <w:bookmarkEnd w:id="23"/>
       <w:r>
         <w:rPr>
@@ -6316,7 +6316,7 @@
         <w:pStyle w:val="Heading3"/>
         <w:rPr/>
       </w:pPr>
-      <w:bookmarkStart w:id="24" w:name="__RefHeading___Toc1427_2949742311"/>
+      <w:bookmarkStart w:id="24" w:name="__RefHeading___Toc1347_2376024671"/>
       <w:bookmarkEnd w:id="24"/>
       <w:r>
         <w:rPr/>
@@ -6345,7 +6345,7 @@
         <w:pStyle w:val="Caption"/>
         <w:rPr/>
       </w:pPr>
-      <w:bookmarkStart w:id="25" w:name="__RefHeading___Toc1531_2949742311"/>
+      <w:bookmarkStart w:id="25" w:name="__RefHeading___Toc1451_2376024671"/>
       <w:bookmarkEnd w:id="25"/>
       <w:r>
         <w:rPr>
@@ -7264,7 +7264,7 @@
         <w:pStyle w:val="Heading2"/>
         <w:rPr/>
       </w:pPr>
-      <w:bookmarkStart w:id="26" w:name="__RefHeading___Toc1429_2949742311"/>
+      <w:bookmarkStart w:id="26" w:name="__RefHeading___Toc1349_2376024671"/>
       <w:bookmarkEnd w:id="26"/>
       <w:r>
         <w:rPr/>
@@ -7276,7 +7276,7 @@
         <w:pStyle w:val="Heading3"/>
         <w:rPr/>
       </w:pPr>
-      <w:bookmarkStart w:id="27" w:name="__RefHeading___Toc1431_2949742311"/>
+      <w:bookmarkStart w:id="27" w:name="__RefHeading___Toc1351_2376024671"/>
       <w:bookmarkEnd w:id="27"/>
       <w:r>
         <w:rPr/>
@@ -7443,7 +7443,7 @@
         <w:pStyle w:val="Caption"/>
         <w:rPr/>
       </w:pPr>
-      <w:bookmarkStart w:id="28" w:name="__RefHeading___Toc1529_2949742311"/>
+      <w:bookmarkStart w:id="28" w:name="__RefHeading___Toc1449_2376024671"/>
       <w:bookmarkEnd w:id="28"/>
       <w:r>
         <w:rPr>
@@ -7524,7 +7524,7 @@
         <w:pStyle w:val="Heading3"/>
         <w:rPr/>
       </w:pPr>
-      <w:bookmarkStart w:id="29" w:name="__RefHeading___Toc1433_2949742311"/>
+      <w:bookmarkStart w:id="29" w:name="__RefHeading___Toc1353_2376024671"/>
       <w:bookmarkEnd w:id="29"/>
       <w:r>
         <w:rPr/>
@@ -7536,7 +7536,7 @@
         <w:pStyle w:val="Caption"/>
         <w:rPr/>
       </w:pPr>
-      <w:bookmarkStart w:id="30" w:name="__RefHeading___Toc1527_2949742311"/>
+      <w:bookmarkStart w:id="30" w:name="__RefHeading___Toc1447_2376024671"/>
       <w:bookmarkEnd w:id="30"/>
       <w:r>
         <w:rPr>
@@ -8161,7 +8161,7 @@
         <w:pStyle w:val="Heading2"/>
         <w:rPr/>
       </w:pPr>
-      <w:bookmarkStart w:id="31" w:name="__RefHeading___Toc1435_2949742311"/>
+      <w:bookmarkStart w:id="31" w:name="__RefHeading___Toc1355_2376024671"/>
       <w:bookmarkEnd w:id="31"/>
       <w:r>
         <w:rPr/>
@@ -8189,7 +8189,7 @@
         <w:pStyle w:val="Heading3"/>
         <w:rPr/>
       </w:pPr>
-      <w:bookmarkStart w:id="32" w:name="__RefHeading___Toc1437_2949742311"/>
+      <w:bookmarkStart w:id="32" w:name="__RefHeading___Toc1357_2376024671"/>
       <w:bookmarkEnd w:id="32"/>
       <w:r>
         <w:rPr/>
@@ -8201,7 +8201,7 @@
         <w:pStyle w:val="Caption"/>
         <w:rPr/>
       </w:pPr>
-      <w:bookmarkStart w:id="33" w:name="__RefHeading___Toc1525_2949742311"/>
+      <w:bookmarkStart w:id="33" w:name="__RefHeading___Toc1445_2376024671"/>
       <w:bookmarkEnd w:id="33"/>
       <w:r>
         <w:rPr>
@@ -9762,7 +9762,7 @@
         <w:pStyle w:val="Heading3"/>
         <w:rPr/>
       </w:pPr>
-      <w:bookmarkStart w:id="34" w:name="__RefHeading___Toc1439_2949742311"/>
+      <w:bookmarkStart w:id="34" w:name="__RefHeading___Toc1359_2376024671"/>
       <w:bookmarkEnd w:id="34"/>
       <w:r>
         <w:rPr/>
@@ -9959,7 +9959,7 @@
         <w:pStyle w:val="Caption"/>
         <w:rPr/>
       </w:pPr>
-      <w:bookmarkStart w:id="35" w:name="__RefHeading___Toc1523_2949742311"/>
+      <w:bookmarkStart w:id="35" w:name="__RefHeading___Toc1443_2376024671"/>
       <w:bookmarkEnd w:id="35"/>
       <w:r>
         <w:rPr>
@@ -9976,7 +9976,7 @@
         <w:pStyle w:val="Heading2"/>
         <w:rPr/>
       </w:pPr>
-      <w:bookmarkStart w:id="36" w:name="__RefHeading___Toc1441_2949742311"/>
+      <w:bookmarkStart w:id="36" w:name="__RefHeading___Toc1361_2376024671"/>
       <w:bookmarkEnd w:id="36"/>
       <w:r>
         <w:rPr/>
@@ -9988,7 +9988,7 @@
         <w:pStyle w:val="Heading3"/>
         <w:rPr/>
       </w:pPr>
-      <w:bookmarkStart w:id="37" w:name="__RefHeading___Toc1443_2949742311"/>
+      <w:bookmarkStart w:id="37" w:name="__RefHeading___Toc1363_2376024671"/>
       <w:bookmarkEnd w:id="37"/>
       <w:r>
         <w:rPr/>
@@ -10120,7 +10120,7 @@
         <w:pStyle w:val="Heading3"/>
         <w:rPr/>
       </w:pPr>
-      <w:bookmarkStart w:id="38" w:name="__RefHeading___Toc1445_2949742311"/>
+      <w:bookmarkStart w:id="38" w:name="__RefHeading___Toc1365_2376024671"/>
       <w:bookmarkEnd w:id="38"/>
       <w:r>
         <w:rPr/>
@@ -10132,7 +10132,7 @@
         <w:pStyle w:val="Caption"/>
         <w:rPr/>
       </w:pPr>
-      <w:bookmarkStart w:id="39" w:name="__RefHeading___Toc1521_2949742311"/>
+      <w:bookmarkStart w:id="39" w:name="__RefHeading___Toc1441_2376024671"/>
       <w:bookmarkEnd w:id="39"/>
       <w:r>
         <w:rPr>
@@ -10534,7 +10534,7 @@
         <w:pStyle w:val="Heading1"/>
         <w:rPr/>
       </w:pPr>
-      <w:bookmarkStart w:id="40" w:name="__RefHeading___Toc1447_2949742311"/>
+      <w:bookmarkStart w:id="40" w:name="__RefHeading___Toc1367_2376024671"/>
       <w:bookmarkEnd w:id="40"/>
       <w:r>
         <w:rPr/>
@@ -10562,7 +10562,7 @@
         <w:pStyle w:val="Heading2"/>
         <w:rPr/>
       </w:pPr>
-      <w:bookmarkStart w:id="41" w:name="__RefHeading___Toc1449_2949742311"/>
+      <w:bookmarkStart w:id="41" w:name="__RefHeading___Toc1369_2376024671"/>
       <w:bookmarkEnd w:id="41"/>
       <w:r>
         <w:rPr/>
@@ -10574,7 +10574,7 @@
         <w:pStyle w:val="Heading3"/>
         <w:rPr/>
       </w:pPr>
-      <w:bookmarkStart w:id="42" w:name="__RefHeading___Toc1451_2949742311"/>
+      <w:bookmarkStart w:id="42" w:name="__RefHeading___Toc1371_2376024671"/>
       <w:bookmarkEnd w:id="42"/>
       <w:r>
         <w:rPr/>
@@ -10736,7 +10736,7 @@
         <w:pStyle w:val="Heading3"/>
         <w:rPr/>
       </w:pPr>
-      <w:bookmarkStart w:id="43" w:name="__RefHeading___Toc1453_2949742311"/>
+      <w:bookmarkStart w:id="43" w:name="__RefHeading___Toc1373_2376024671"/>
       <w:bookmarkEnd w:id="43"/>
       <w:r>
         <w:rPr/>
@@ -10898,7 +10898,7 @@
         <w:pStyle w:val="Heading2"/>
         <w:rPr/>
       </w:pPr>
-      <w:bookmarkStart w:id="44" w:name="__RefHeading___Toc1455_2949742311"/>
+      <w:bookmarkStart w:id="44" w:name="__RefHeading___Toc1375_2376024671"/>
       <w:bookmarkEnd w:id="44"/>
       <w:r>
         <w:rPr/>
@@ -11033,7 +11033,7 @@
         <w:pStyle w:val="Heading3"/>
         <w:rPr/>
       </w:pPr>
-      <w:bookmarkStart w:id="45" w:name="__RefHeading___Toc1457_2949742311"/>
+      <w:bookmarkStart w:id="45" w:name="__RefHeading___Toc1377_2376024671"/>
       <w:bookmarkEnd w:id="45"/>
       <w:r>
         <w:rPr/>
@@ -11045,7 +11045,7 @@
         <w:pStyle w:val="Caption"/>
         <w:rPr/>
       </w:pPr>
-      <w:bookmarkStart w:id="46" w:name="__RefHeading___Toc1519_2949742311"/>
+      <w:bookmarkStart w:id="46" w:name="__RefHeading___Toc1439_2376024671"/>
       <w:bookmarkEnd w:id="46"/>
       <w:r>
         <w:rPr>
@@ -11599,7 +11599,7 @@
         <w:pStyle w:val="Heading2"/>
         <w:rPr/>
       </w:pPr>
-      <w:bookmarkStart w:id="47" w:name="__RefHeading___Toc1459_2949742311"/>
+      <w:bookmarkStart w:id="47" w:name="__RefHeading___Toc1379_2376024671"/>
       <w:bookmarkEnd w:id="47"/>
       <w:r>
         <w:rPr/>
@@ -11627,7 +11627,7 @@
         <w:pStyle w:val="Caption"/>
         <w:rPr/>
       </w:pPr>
-      <w:bookmarkStart w:id="48" w:name="__RefHeading___Toc1517_2949742311"/>
+      <w:bookmarkStart w:id="48" w:name="__RefHeading___Toc1437_2376024671"/>
       <w:bookmarkEnd w:id="48"/>
       <w:r>
         <w:rPr>
@@ -13730,7 +13730,7 @@
         <w:pStyle w:val="Heading2"/>
         <w:rPr/>
       </w:pPr>
-      <w:bookmarkStart w:id="49" w:name="__RefHeading___Toc1461_2949742311"/>
+      <w:bookmarkStart w:id="49" w:name="__RefHeading___Toc1381_2376024671"/>
       <w:bookmarkEnd w:id="49"/>
       <w:r>
         <w:rPr/>
@@ -13750,7 +13750,7 @@
           <w:b w:val="false"/>
           <w:i w:val="false"/>
         </w:rPr>
-        <w:t>Các mục dưới đây mô tả giao diện chính theo từng vai trò. Các khung ảnh cần được thay bằng ảnh chụp màn hình thực tế sau khi chạy hệ thống.</w:t>
+        <w:t>Các mục dưới đây mô tả giao diện chính của hệ thống theo từng vai trò, được chụp từ hệ thống chạy trên máy chủ cục bộ với dữ liệu mẫu.</w:t>
       </w:r>
     </w:p>
     <w:p>
@@ -13758,7 +13758,7 @@
         <w:pStyle w:val="Heading3"/>
         <w:rPr/>
       </w:pPr>
-      <w:bookmarkStart w:id="50" w:name="__RefHeading___Toc1463_2949742311"/>
+      <w:bookmarkStart w:id="50" w:name="__RefHeading___Toc1383_2376024671"/>
       <w:bookmarkEnd w:id="50"/>
       <w:r>
         <w:rPr/>
@@ -13782,66 +13782,61 @@
         <w:t>Trang đăng nhập: nhập tên đăng nhập và mật khẩu, điều hướng đến bảng điều khiển theo vai trò.</w:t>
       </w:r>
     </w:p>
-    <w:tbl>
-      <w:tblPr>
-        <w:tblW w:w="9071" w:type="dxa"/>
+    <w:p>
+      <w:pPr>
+        <w:pStyle w:val="Normal"/>
+        <w:keepNext w:val="true"/>
+        <w:spacing w:before="0" w:after="40"/>
         <w:jc w:val="center"/>
-        <w:tblInd w:w="0" w:type="dxa"/>
-        <w:tblLayout w:type="fixed"/>
-        <w:tblCellMar>
-          <w:top w:w="0" w:type="dxa"/>
-          <w:left w:w="108" w:type="dxa"/>
-          <w:bottom w:w="0" w:type="dxa"/>
-          <w:right w:w="108" w:type="dxa"/>
-        </w:tblCellMar>
-        <w:tblLook w:val="04a0" w:noHBand="0" w:noVBand="1" w:firstColumn="1" w:lastRow="0" w:lastColumn="0" w:firstRow="1"/>
-      </w:tblPr>
-      <w:tblGrid>
-        <w:gridCol w:w="9071"/>
-      </w:tblGrid>
-      <w:tr>
-        <w:trPr>
-          <w:trHeight w:val="2835" w:hRule="atLeast"/>
-        </w:trPr>
-        <w:tc>
-          <w:tcPr>
-            <w:tcW w:w="9071" w:type="dxa"/>
-            <w:tcBorders>
-              <w:top w:val="single" w:sz="4" w:space="0" w:color="000000"/>
-              <w:left w:val="single" w:sz="4" w:space="0" w:color="000000"/>
-              <w:bottom w:val="single" w:sz="4" w:space="0" w:color="000000"/>
-              <w:right w:val="single" w:sz="4" w:space="0" w:color="000000"/>
-            </w:tcBorders>
-            <w:shd w:color="auto" w:fill="F2F2F2" w:val="clear"/>
-            <w:vAlign w:val="center"/>
-          </w:tcPr>
-          <w:p>
-            <w:pPr>
-              <w:pStyle w:val="Normal"/>
-              <w:spacing w:before="300" w:after="0"/>
-              <w:jc w:val="center"/>
-              <w:rPr/>
-            </w:pPr>
-            <w:r>
-              <w:rPr>
-                <w:i/>
-                <w:color w:val="555555"/>
-                <w:sz w:val="22"/>
-              </w:rPr>
-              <w:t>[Chèn ảnh chụp màn hình]</w:t>
-              <w:br/>
-              <w:t>Giao diện đăng nhập</w:t>
-            </w:r>
-          </w:p>
-        </w:tc>
-      </w:tr>
-    </w:tbl>
+        <w:rPr/>
+      </w:pPr>
+      <w:r>
+        <w:rPr/>
+        <w:drawing>
+          <wp:inline distT="0" distB="0" distL="0" distR="0">
+            <wp:extent cx="5579745" cy="3268345"/>
+            <wp:effectExtent l="0" t="0" r="0" b="0"/>
+            <wp:docPr id="6" name="Picture 6" descr=""/>
+            <wp:cNvGraphicFramePr>
+              <a:graphicFrameLocks xmlns:a="http://schemas.openxmlformats.org/drawingml/2006/main" noChangeAspect="1"/>
+            </wp:cNvGraphicFramePr>
+            <a:graphic xmlns:a="http://schemas.openxmlformats.org/drawingml/2006/main">
+              <a:graphicData uri="http://schemas.openxmlformats.org/drawingml/2006/picture">
+                <pic:pic xmlns:pic="http://schemas.openxmlformats.org/drawingml/2006/picture">
+                  <pic:nvPicPr>
+                    <pic:cNvPr id="6" name="Picture 6" descr=""/>
+                    <pic:cNvPicPr>
+                      <a:picLocks noChangeAspect="1" noChangeArrowheads="1"/>
+                    </pic:cNvPicPr>
+                  </pic:nvPicPr>
+                  <pic:blipFill>
+                    <a:blip r:embed="rId7"/>
+                    <a:stretch>
+                      <a:fillRect/>
+                    </a:stretch>
+                  </pic:blipFill>
+                  <pic:spPr bwMode="auto">
+                    <a:xfrm>
+                      <a:off x="0" y="0"/>
+                      <a:ext cx="5579745" cy="3268345"/>
+                    </a:xfrm>
+                    <a:prstGeom prst="rect">
+                      <a:avLst/>
+                    </a:prstGeom>
+                  </pic:spPr>
+                </pic:pic>
+              </a:graphicData>
+            </a:graphic>
+          </wp:inline>
+        </w:drawing>
+      </w:r>
+    </w:p>
     <w:p>
       <w:pPr>
         <w:pStyle w:val="Caption"/>
         <w:rPr/>
       </w:pPr>
-      <w:bookmarkStart w:id="51" w:name="__RefHeading___Toc1515_2949742311"/>
+      <w:bookmarkStart w:id="51" w:name="__RefHeading___Toc1435_2376024671"/>
       <w:bookmarkEnd w:id="51"/>
       <w:r>
         <w:rPr>
@@ -13867,69 +13862,64 @@
           <w:b w:val="false"/>
           <w:i w:val="false"/>
         </w:rPr>
-        <w:t>Quên mật khẩu: nhập email, nhận OTP 6 chữ số, nhập mã, đặt mật khẩu mới.</w:t>
-      </w:r>
-    </w:p>
-    <w:tbl>
-      <w:tblPr>
-        <w:tblW w:w="9071" w:type="dxa"/>
+        <w:t>Quên mật khẩu: nhập email để nhận OTP 6 chữ số, sau đó nhập mã và đặt mật khẩu mới.</w:t>
+      </w:r>
+    </w:p>
+    <w:p>
+      <w:pPr>
+        <w:pStyle w:val="Normal"/>
+        <w:keepNext w:val="true"/>
+        <w:spacing w:before="0" w:after="40"/>
         <w:jc w:val="center"/>
-        <w:tblInd w:w="0" w:type="dxa"/>
-        <w:tblLayout w:type="fixed"/>
-        <w:tblCellMar>
-          <w:top w:w="0" w:type="dxa"/>
-          <w:left w:w="108" w:type="dxa"/>
-          <w:bottom w:w="0" w:type="dxa"/>
-          <w:right w:w="108" w:type="dxa"/>
-        </w:tblCellMar>
-        <w:tblLook w:val="04a0" w:noHBand="0" w:noVBand="1" w:firstColumn="1" w:lastRow="0" w:lastColumn="0" w:firstRow="1"/>
-      </w:tblPr>
-      <w:tblGrid>
-        <w:gridCol w:w="9071"/>
-      </w:tblGrid>
-      <w:tr>
-        <w:trPr>
-          <w:trHeight w:val="2835" w:hRule="atLeast"/>
-        </w:trPr>
-        <w:tc>
-          <w:tcPr>
-            <w:tcW w:w="9071" w:type="dxa"/>
-            <w:tcBorders>
-              <w:top w:val="single" w:sz="4" w:space="0" w:color="000000"/>
-              <w:left w:val="single" w:sz="4" w:space="0" w:color="000000"/>
-              <w:bottom w:val="single" w:sz="4" w:space="0" w:color="000000"/>
-              <w:right w:val="single" w:sz="4" w:space="0" w:color="000000"/>
-            </w:tcBorders>
-            <w:shd w:color="auto" w:fill="F2F2F2" w:val="clear"/>
-            <w:vAlign w:val="center"/>
-          </w:tcPr>
-          <w:p>
-            <w:pPr>
-              <w:pStyle w:val="Normal"/>
-              <w:spacing w:before="300" w:after="0"/>
-              <w:jc w:val="center"/>
-              <w:rPr/>
-            </w:pPr>
-            <w:r>
-              <w:rPr>
-                <w:i/>
-                <w:color w:val="555555"/>
-                <w:sz w:val="22"/>
-              </w:rPr>
-              <w:t>[Chèn ảnh chụp màn hình]</w:t>
-              <w:br/>
-              <w:t>Giao diện quên mật khẩu và nhập OTP</w:t>
-            </w:r>
-          </w:p>
-        </w:tc>
-      </w:tr>
-    </w:tbl>
+        <w:rPr/>
+      </w:pPr>
+      <w:r>
+        <w:rPr/>
+        <w:drawing>
+          <wp:inline distT="0" distB="0" distL="0" distR="0">
+            <wp:extent cx="5579745" cy="3268345"/>
+            <wp:effectExtent l="0" t="0" r="0" b="0"/>
+            <wp:docPr id="7" name="Picture 7" descr=""/>
+            <wp:cNvGraphicFramePr>
+              <a:graphicFrameLocks xmlns:a="http://schemas.openxmlformats.org/drawingml/2006/main" noChangeAspect="1"/>
+            </wp:cNvGraphicFramePr>
+            <a:graphic xmlns:a="http://schemas.openxmlformats.org/drawingml/2006/main">
+              <a:graphicData uri="http://schemas.openxmlformats.org/drawingml/2006/picture">
+                <pic:pic xmlns:pic="http://schemas.openxmlformats.org/drawingml/2006/picture">
+                  <pic:nvPicPr>
+                    <pic:cNvPr id="7" name="Picture 7" descr=""/>
+                    <pic:cNvPicPr>
+                      <a:picLocks noChangeAspect="1" noChangeArrowheads="1"/>
+                    </pic:cNvPicPr>
+                  </pic:nvPicPr>
+                  <pic:blipFill>
+                    <a:blip r:embed="rId8"/>
+                    <a:stretch>
+                      <a:fillRect/>
+                    </a:stretch>
+                  </pic:blipFill>
+                  <pic:spPr bwMode="auto">
+                    <a:xfrm>
+                      <a:off x="0" y="0"/>
+                      <a:ext cx="5579745" cy="3268345"/>
+                    </a:xfrm>
+                    <a:prstGeom prst="rect">
+                      <a:avLst/>
+                    </a:prstGeom>
+                  </pic:spPr>
+                </pic:pic>
+              </a:graphicData>
+            </a:graphic>
+          </wp:inline>
+        </w:drawing>
+      </w:r>
+    </w:p>
     <w:p>
       <w:pPr>
         <w:pStyle w:val="Caption"/>
         <w:rPr/>
       </w:pPr>
-      <w:bookmarkStart w:id="52" w:name="__RefHeading___Toc1513_2949742311"/>
+      <w:bookmarkStart w:id="52" w:name="__RefHeading___Toc1433_2376024671"/>
       <w:bookmarkEnd w:id="52"/>
       <w:r>
         <w:rPr>
@@ -13938,7 +13928,7 @@
           <w:color w:val="000000"/>
           <w:sz w:val="24"/>
         </w:rPr>
-        <w:t>Hình 3.2. Giao diện quên mật khẩu và nhập OTP</w:t>
+        <w:t>Hình 3.2. Giao diện quên mật khẩu</w:t>
       </w:r>
     </w:p>
     <w:p>
@@ -13946,7 +13936,7 @@
         <w:pStyle w:val="Heading3"/>
         <w:rPr/>
       </w:pPr>
-      <w:bookmarkStart w:id="53" w:name="__RefHeading___Toc1465_2949742311"/>
+      <w:bookmarkStart w:id="53" w:name="__RefHeading___Toc1385_2376024671"/>
       <w:bookmarkEnd w:id="53"/>
       <w:r>
         <w:rPr/>
@@ -13970,66 +13960,61 @@
         <w:t>Cơ hội thực tập: danh sách vị trí xếp hạng theo độ phù hợp, nút “Gợi ý bằng AI” và ứng tuyển.</w:t>
       </w:r>
     </w:p>
-    <w:tbl>
-      <w:tblPr>
-        <w:tblW w:w="9071" w:type="dxa"/>
+    <w:p>
+      <w:pPr>
+        <w:pStyle w:val="Normal"/>
+        <w:keepNext w:val="true"/>
+        <w:spacing w:before="0" w:after="40"/>
         <w:jc w:val="center"/>
-        <w:tblInd w:w="0" w:type="dxa"/>
-        <w:tblLayout w:type="fixed"/>
-        <w:tblCellMar>
-          <w:top w:w="0" w:type="dxa"/>
-          <w:left w:w="108" w:type="dxa"/>
-          <w:bottom w:w="0" w:type="dxa"/>
-          <w:right w:w="108" w:type="dxa"/>
-        </w:tblCellMar>
-        <w:tblLook w:val="04a0" w:noHBand="0" w:noVBand="1" w:firstColumn="1" w:lastRow="0" w:lastColumn="0" w:firstRow="1"/>
-      </w:tblPr>
-      <w:tblGrid>
-        <w:gridCol w:w="9071"/>
-      </w:tblGrid>
-      <w:tr>
-        <w:trPr>
-          <w:trHeight w:val="2835" w:hRule="atLeast"/>
-        </w:trPr>
-        <w:tc>
-          <w:tcPr>
-            <w:tcW w:w="9071" w:type="dxa"/>
-            <w:tcBorders>
-              <w:top w:val="single" w:sz="4" w:space="0" w:color="000000"/>
-              <w:left w:val="single" w:sz="4" w:space="0" w:color="000000"/>
-              <w:bottom w:val="single" w:sz="4" w:space="0" w:color="000000"/>
-              <w:right w:val="single" w:sz="4" w:space="0" w:color="000000"/>
-            </w:tcBorders>
-            <w:shd w:color="auto" w:fill="F2F2F2" w:val="clear"/>
-            <w:vAlign w:val="center"/>
-          </w:tcPr>
-          <w:p>
-            <w:pPr>
-              <w:pStyle w:val="Normal"/>
-              <w:spacing w:before="300" w:after="0"/>
-              <w:jc w:val="center"/>
-              <w:rPr/>
-            </w:pPr>
-            <w:r>
-              <w:rPr>
-                <w:i/>
-                <w:color w:val="555555"/>
-                <w:sz w:val="22"/>
-              </w:rPr>
-              <w:t>[Chèn ảnh chụp màn hình]</w:t>
-              <w:br/>
-              <w:t>Giao diện cơ hội thực tập và gợi ý AI</w:t>
-            </w:r>
-          </w:p>
-        </w:tc>
-      </w:tr>
-    </w:tbl>
+        <w:rPr/>
+      </w:pPr>
+      <w:r>
+        <w:rPr/>
+        <w:drawing>
+          <wp:inline distT="0" distB="0" distL="0" distR="0">
+            <wp:extent cx="5579745" cy="3268345"/>
+            <wp:effectExtent l="0" t="0" r="0" b="0"/>
+            <wp:docPr id="8" name="Picture 8" descr=""/>
+            <wp:cNvGraphicFramePr>
+              <a:graphicFrameLocks xmlns:a="http://schemas.openxmlformats.org/drawingml/2006/main" noChangeAspect="1"/>
+            </wp:cNvGraphicFramePr>
+            <a:graphic xmlns:a="http://schemas.openxmlformats.org/drawingml/2006/main">
+              <a:graphicData uri="http://schemas.openxmlformats.org/drawingml/2006/picture">
+                <pic:pic xmlns:pic="http://schemas.openxmlformats.org/drawingml/2006/picture">
+                  <pic:nvPicPr>
+                    <pic:cNvPr id="8" name="Picture 8" descr=""/>
+                    <pic:cNvPicPr>
+                      <a:picLocks noChangeAspect="1" noChangeArrowheads="1"/>
+                    </pic:cNvPicPr>
+                  </pic:nvPicPr>
+                  <pic:blipFill>
+                    <a:blip r:embed="rId9"/>
+                    <a:stretch>
+                      <a:fillRect/>
+                    </a:stretch>
+                  </pic:blipFill>
+                  <pic:spPr bwMode="auto">
+                    <a:xfrm>
+                      <a:off x="0" y="0"/>
+                      <a:ext cx="5579745" cy="3268345"/>
+                    </a:xfrm>
+                    <a:prstGeom prst="rect">
+                      <a:avLst/>
+                    </a:prstGeom>
+                  </pic:spPr>
+                </pic:pic>
+              </a:graphicData>
+            </a:graphic>
+          </wp:inline>
+        </w:drawing>
+      </w:r>
+    </w:p>
     <w:p>
       <w:pPr>
         <w:pStyle w:val="Caption"/>
         <w:rPr/>
       </w:pPr>
-      <w:bookmarkStart w:id="54" w:name="__RefHeading___Toc1511_2949742311"/>
+      <w:bookmarkStart w:id="54" w:name="__RefHeading___Toc1431_2376024671"/>
       <w:bookmarkEnd w:id="54"/>
       <w:r>
         <w:rPr>
@@ -14058,66 +14043,61 @@
         <w:t>Nhật ký và báo cáo: ghi nhật ký theo ngày, nộp báo cáo đề cương, giữa kỳ, cuối kỳ.</w:t>
       </w:r>
     </w:p>
-    <w:tbl>
-      <w:tblPr>
-        <w:tblW w:w="9071" w:type="dxa"/>
+    <w:p>
+      <w:pPr>
+        <w:pStyle w:val="Normal"/>
+        <w:keepNext w:val="true"/>
+        <w:spacing w:before="0" w:after="40"/>
         <w:jc w:val="center"/>
-        <w:tblInd w:w="0" w:type="dxa"/>
-        <w:tblLayout w:type="fixed"/>
-        <w:tblCellMar>
-          <w:top w:w="0" w:type="dxa"/>
-          <w:left w:w="108" w:type="dxa"/>
-          <w:bottom w:w="0" w:type="dxa"/>
-          <w:right w:w="108" w:type="dxa"/>
-        </w:tblCellMar>
-        <w:tblLook w:val="04a0" w:noHBand="0" w:noVBand="1" w:firstColumn="1" w:lastRow="0" w:lastColumn="0" w:firstRow="1"/>
-      </w:tblPr>
-      <w:tblGrid>
-        <w:gridCol w:w="9071"/>
-      </w:tblGrid>
-      <w:tr>
-        <w:trPr>
-          <w:trHeight w:val="2835" w:hRule="atLeast"/>
-        </w:trPr>
-        <w:tc>
-          <w:tcPr>
-            <w:tcW w:w="9071" w:type="dxa"/>
-            <w:tcBorders>
-              <w:top w:val="single" w:sz="4" w:space="0" w:color="000000"/>
-              <w:left w:val="single" w:sz="4" w:space="0" w:color="000000"/>
-              <w:bottom w:val="single" w:sz="4" w:space="0" w:color="000000"/>
-              <w:right w:val="single" w:sz="4" w:space="0" w:color="000000"/>
-            </w:tcBorders>
-            <w:shd w:color="auto" w:fill="F2F2F2" w:val="clear"/>
-            <w:vAlign w:val="center"/>
-          </w:tcPr>
-          <w:p>
-            <w:pPr>
-              <w:pStyle w:val="Normal"/>
-              <w:spacing w:before="300" w:after="0"/>
-              <w:jc w:val="center"/>
-              <w:rPr/>
-            </w:pPr>
-            <w:r>
-              <w:rPr>
-                <w:i/>
-                <w:color w:val="555555"/>
-                <w:sz w:val="22"/>
-              </w:rPr>
-              <w:t>[Chèn ảnh chụp màn hình]</w:t>
-              <w:br/>
-              <w:t>Giao diện nhật ký thực tập</w:t>
-            </w:r>
-          </w:p>
-        </w:tc>
-      </w:tr>
-    </w:tbl>
+        <w:rPr/>
+      </w:pPr>
+      <w:r>
+        <w:rPr/>
+        <w:drawing>
+          <wp:inline distT="0" distB="0" distL="0" distR="0">
+            <wp:extent cx="5579745" cy="3268345"/>
+            <wp:effectExtent l="0" t="0" r="0" b="0"/>
+            <wp:docPr id="9" name="Picture 9" descr=""/>
+            <wp:cNvGraphicFramePr>
+              <a:graphicFrameLocks xmlns:a="http://schemas.openxmlformats.org/drawingml/2006/main" noChangeAspect="1"/>
+            </wp:cNvGraphicFramePr>
+            <a:graphic xmlns:a="http://schemas.openxmlformats.org/drawingml/2006/main">
+              <a:graphicData uri="http://schemas.openxmlformats.org/drawingml/2006/picture">
+                <pic:pic xmlns:pic="http://schemas.openxmlformats.org/drawingml/2006/picture">
+                  <pic:nvPicPr>
+                    <pic:cNvPr id="9" name="Picture 9" descr=""/>
+                    <pic:cNvPicPr>
+                      <a:picLocks noChangeAspect="1" noChangeArrowheads="1"/>
+                    </pic:cNvPicPr>
+                  </pic:nvPicPr>
+                  <pic:blipFill>
+                    <a:blip r:embed="rId10"/>
+                    <a:stretch>
+                      <a:fillRect/>
+                    </a:stretch>
+                  </pic:blipFill>
+                  <pic:spPr bwMode="auto">
+                    <a:xfrm>
+                      <a:off x="0" y="0"/>
+                      <a:ext cx="5579745" cy="3268345"/>
+                    </a:xfrm>
+                    <a:prstGeom prst="rect">
+                      <a:avLst/>
+                    </a:prstGeom>
+                  </pic:spPr>
+                </pic:pic>
+              </a:graphicData>
+            </a:graphic>
+          </wp:inline>
+        </w:drawing>
+      </w:r>
+    </w:p>
     <w:p>
       <w:pPr>
         <w:pStyle w:val="Caption"/>
         <w:rPr/>
       </w:pPr>
-      <w:bookmarkStart w:id="55" w:name="__RefHeading___Toc1509_2949742311"/>
+      <w:bookmarkStart w:id="55" w:name="__RefHeading___Toc1429_2376024671"/>
       <w:bookmarkEnd w:id="55"/>
       <w:r>
         <w:rPr>
@@ -14146,66 +14126,61 @@
         <w:t>Nhiệm vụ: danh sách nhiệm vụ, nộp minh chứng bằng liên kết hoặc tệp.</w:t>
       </w:r>
     </w:p>
-    <w:tbl>
-      <w:tblPr>
-        <w:tblW w:w="9071" w:type="dxa"/>
+    <w:p>
+      <w:pPr>
+        <w:pStyle w:val="Normal"/>
+        <w:keepNext w:val="true"/>
+        <w:spacing w:before="0" w:after="40"/>
         <w:jc w:val="center"/>
-        <w:tblInd w:w="0" w:type="dxa"/>
-        <w:tblLayout w:type="fixed"/>
-        <w:tblCellMar>
-          <w:top w:w="0" w:type="dxa"/>
-          <w:left w:w="108" w:type="dxa"/>
-          <w:bottom w:w="0" w:type="dxa"/>
-          <w:right w:w="108" w:type="dxa"/>
-        </w:tblCellMar>
-        <w:tblLook w:val="04a0" w:noHBand="0" w:noVBand="1" w:firstColumn="1" w:lastRow="0" w:lastColumn="0" w:firstRow="1"/>
-      </w:tblPr>
-      <w:tblGrid>
-        <w:gridCol w:w="9071"/>
-      </w:tblGrid>
-      <w:tr>
-        <w:trPr>
-          <w:trHeight w:val="2835" w:hRule="atLeast"/>
-        </w:trPr>
-        <w:tc>
-          <w:tcPr>
-            <w:tcW w:w="9071" w:type="dxa"/>
-            <w:tcBorders>
-              <w:top w:val="single" w:sz="4" w:space="0" w:color="000000"/>
-              <w:left w:val="single" w:sz="4" w:space="0" w:color="000000"/>
-              <w:bottom w:val="single" w:sz="4" w:space="0" w:color="000000"/>
-              <w:right w:val="single" w:sz="4" w:space="0" w:color="000000"/>
-            </w:tcBorders>
-            <w:shd w:color="auto" w:fill="F2F2F2" w:val="clear"/>
-            <w:vAlign w:val="center"/>
-          </w:tcPr>
-          <w:p>
-            <w:pPr>
-              <w:pStyle w:val="Normal"/>
-              <w:spacing w:before="300" w:after="0"/>
-              <w:jc w:val="center"/>
-              <w:rPr/>
-            </w:pPr>
-            <w:r>
-              <w:rPr>
-                <w:i/>
-                <w:color w:val="555555"/>
-                <w:sz w:val="22"/>
-              </w:rPr>
-              <w:t>[Chèn ảnh chụp màn hình]</w:t>
-              <w:br/>
-              <w:t>Giao diện nhiệm vụ của sinh viên</w:t>
-            </w:r>
-          </w:p>
-        </w:tc>
-      </w:tr>
-    </w:tbl>
+        <w:rPr/>
+      </w:pPr>
+      <w:r>
+        <w:rPr/>
+        <w:drawing>
+          <wp:inline distT="0" distB="0" distL="0" distR="0">
+            <wp:extent cx="5579745" cy="3268345"/>
+            <wp:effectExtent l="0" t="0" r="0" b="0"/>
+            <wp:docPr id="10" name="Picture 10" descr=""/>
+            <wp:cNvGraphicFramePr>
+              <a:graphicFrameLocks xmlns:a="http://schemas.openxmlformats.org/drawingml/2006/main" noChangeAspect="1"/>
+            </wp:cNvGraphicFramePr>
+            <a:graphic xmlns:a="http://schemas.openxmlformats.org/drawingml/2006/main">
+              <a:graphicData uri="http://schemas.openxmlformats.org/drawingml/2006/picture">
+                <pic:pic xmlns:pic="http://schemas.openxmlformats.org/drawingml/2006/picture">
+                  <pic:nvPicPr>
+                    <pic:cNvPr id="10" name="Picture 10" descr=""/>
+                    <pic:cNvPicPr>
+                      <a:picLocks noChangeAspect="1" noChangeArrowheads="1"/>
+                    </pic:cNvPicPr>
+                  </pic:nvPicPr>
+                  <pic:blipFill>
+                    <a:blip r:embed="rId11"/>
+                    <a:stretch>
+                      <a:fillRect/>
+                    </a:stretch>
+                  </pic:blipFill>
+                  <pic:spPr bwMode="auto">
+                    <a:xfrm>
+                      <a:off x="0" y="0"/>
+                      <a:ext cx="5579745" cy="3268345"/>
+                    </a:xfrm>
+                    <a:prstGeom prst="rect">
+                      <a:avLst/>
+                    </a:prstGeom>
+                  </pic:spPr>
+                </pic:pic>
+              </a:graphicData>
+            </a:graphic>
+          </wp:inline>
+        </w:drawing>
+      </w:r>
+    </w:p>
     <w:p>
       <w:pPr>
         <w:pStyle w:val="Caption"/>
         <w:rPr/>
       </w:pPr>
-      <w:bookmarkStart w:id="56" w:name="__RefHeading___Toc1507_2949742311"/>
+      <w:bookmarkStart w:id="56" w:name="__RefHeading___Toc1427_2376024671"/>
       <w:bookmarkEnd w:id="56"/>
       <w:r>
         <w:rPr>
@@ -14234,66 +14209,61 @@
         <w:t>Bong bóng chat AI ở góc dưới bên phải mọi trang.</w:t>
       </w:r>
     </w:p>
-    <w:tbl>
-      <w:tblPr>
-        <w:tblW w:w="9071" w:type="dxa"/>
+    <w:p>
+      <w:pPr>
+        <w:pStyle w:val="Normal"/>
+        <w:keepNext w:val="true"/>
+        <w:spacing w:before="0" w:after="40"/>
         <w:jc w:val="center"/>
-        <w:tblInd w:w="0" w:type="dxa"/>
-        <w:tblLayout w:type="fixed"/>
-        <w:tblCellMar>
-          <w:top w:w="0" w:type="dxa"/>
-          <w:left w:w="108" w:type="dxa"/>
-          <w:bottom w:w="0" w:type="dxa"/>
-          <w:right w:w="108" w:type="dxa"/>
-        </w:tblCellMar>
-        <w:tblLook w:val="04a0" w:noHBand="0" w:noVBand="1" w:firstColumn="1" w:lastRow="0" w:lastColumn="0" w:firstRow="1"/>
-      </w:tblPr>
-      <w:tblGrid>
-        <w:gridCol w:w="9071"/>
-      </w:tblGrid>
-      <w:tr>
-        <w:trPr>
-          <w:trHeight w:val="2835" w:hRule="atLeast"/>
-        </w:trPr>
-        <w:tc>
-          <w:tcPr>
-            <w:tcW w:w="9071" w:type="dxa"/>
-            <w:tcBorders>
-              <w:top w:val="single" w:sz="4" w:space="0" w:color="000000"/>
-              <w:left w:val="single" w:sz="4" w:space="0" w:color="000000"/>
-              <w:bottom w:val="single" w:sz="4" w:space="0" w:color="000000"/>
-              <w:right w:val="single" w:sz="4" w:space="0" w:color="000000"/>
-            </w:tcBorders>
-            <w:shd w:color="auto" w:fill="F2F2F2" w:val="clear"/>
-            <w:vAlign w:val="center"/>
-          </w:tcPr>
-          <w:p>
-            <w:pPr>
-              <w:pStyle w:val="Normal"/>
-              <w:spacing w:before="300" w:after="0"/>
-              <w:jc w:val="center"/>
-              <w:rPr/>
-            </w:pPr>
-            <w:r>
-              <w:rPr>
-                <w:i/>
-                <w:color w:val="555555"/>
-                <w:sz w:val="22"/>
-              </w:rPr>
-              <w:t>[Chèn ảnh chụp màn hình]</w:t>
-              <w:br/>
-              <w:t>Giao diện bong bóng chat AI</w:t>
-            </w:r>
-          </w:p>
-        </w:tc>
-      </w:tr>
-    </w:tbl>
+        <w:rPr/>
+      </w:pPr>
+      <w:r>
+        <w:rPr/>
+        <w:drawing>
+          <wp:inline distT="0" distB="0" distL="0" distR="0">
+            <wp:extent cx="5579745" cy="3268345"/>
+            <wp:effectExtent l="0" t="0" r="0" b="0"/>
+            <wp:docPr id="11" name="Picture 11" descr=""/>
+            <wp:cNvGraphicFramePr>
+              <a:graphicFrameLocks xmlns:a="http://schemas.openxmlformats.org/drawingml/2006/main" noChangeAspect="1"/>
+            </wp:cNvGraphicFramePr>
+            <a:graphic xmlns:a="http://schemas.openxmlformats.org/drawingml/2006/main">
+              <a:graphicData uri="http://schemas.openxmlformats.org/drawingml/2006/picture">
+                <pic:pic xmlns:pic="http://schemas.openxmlformats.org/drawingml/2006/picture">
+                  <pic:nvPicPr>
+                    <pic:cNvPr id="11" name="Picture 11" descr=""/>
+                    <pic:cNvPicPr>
+                      <a:picLocks noChangeAspect="1" noChangeArrowheads="1"/>
+                    </pic:cNvPicPr>
+                  </pic:nvPicPr>
+                  <pic:blipFill>
+                    <a:blip r:embed="rId12"/>
+                    <a:stretch>
+                      <a:fillRect/>
+                    </a:stretch>
+                  </pic:blipFill>
+                  <pic:spPr bwMode="auto">
+                    <a:xfrm>
+                      <a:off x="0" y="0"/>
+                      <a:ext cx="5579745" cy="3268345"/>
+                    </a:xfrm>
+                    <a:prstGeom prst="rect">
+                      <a:avLst/>
+                    </a:prstGeom>
+                  </pic:spPr>
+                </pic:pic>
+              </a:graphicData>
+            </a:graphic>
+          </wp:inline>
+        </w:drawing>
+      </w:r>
+    </w:p>
     <w:p>
       <w:pPr>
         <w:pStyle w:val="Caption"/>
         <w:rPr/>
       </w:pPr>
-      <w:bookmarkStart w:id="57" w:name="__RefHeading___Toc1505_2949742311"/>
+      <w:bookmarkStart w:id="57" w:name="__RefHeading___Toc1425_2376024671"/>
       <w:bookmarkEnd w:id="57"/>
       <w:r>
         <w:rPr>
@@ -14310,7 +14280,7 @@
         <w:pStyle w:val="Heading3"/>
         <w:rPr/>
       </w:pPr>
-      <w:bookmarkStart w:id="58" w:name="__RefHeading___Toc1467_2949742311"/>
+      <w:bookmarkStart w:id="58" w:name="__RefHeading___Toc1387_2376024671"/>
       <w:bookmarkEnd w:id="58"/>
       <w:r>
         <w:rPr/>
@@ -14334,66 +14304,61 @@
         <w:t>Vị trí tuyển dụng và hồ sơ ứng viên: đăng tin, xem CV, duyệt hồ sơ.</w:t>
       </w:r>
     </w:p>
-    <w:tbl>
-      <w:tblPr>
-        <w:tblW w:w="9071" w:type="dxa"/>
+    <w:p>
+      <w:pPr>
+        <w:pStyle w:val="Normal"/>
+        <w:keepNext w:val="true"/>
+        <w:spacing w:before="0" w:after="40"/>
         <w:jc w:val="center"/>
-        <w:tblInd w:w="0" w:type="dxa"/>
-        <w:tblLayout w:type="fixed"/>
-        <w:tblCellMar>
-          <w:top w:w="0" w:type="dxa"/>
-          <w:left w:w="108" w:type="dxa"/>
-          <w:bottom w:w="0" w:type="dxa"/>
-          <w:right w:w="108" w:type="dxa"/>
-        </w:tblCellMar>
-        <w:tblLook w:val="04a0" w:noHBand="0" w:noVBand="1" w:firstColumn="1" w:lastRow="0" w:lastColumn="0" w:firstRow="1"/>
-      </w:tblPr>
-      <w:tblGrid>
-        <w:gridCol w:w="9071"/>
-      </w:tblGrid>
-      <w:tr>
-        <w:trPr>
-          <w:trHeight w:val="2835" w:hRule="atLeast"/>
-        </w:trPr>
-        <w:tc>
-          <w:tcPr>
-            <w:tcW w:w="9071" w:type="dxa"/>
-            <w:tcBorders>
-              <w:top w:val="single" w:sz="4" w:space="0" w:color="000000"/>
-              <w:left w:val="single" w:sz="4" w:space="0" w:color="000000"/>
-              <w:bottom w:val="single" w:sz="4" w:space="0" w:color="000000"/>
-              <w:right w:val="single" w:sz="4" w:space="0" w:color="000000"/>
-            </w:tcBorders>
-            <w:shd w:color="auto" w:fill="F2F2F2" w:val="clear"/>
-            <w:vAlign w:val="center"/>
-          </w:tcPr>
-          <w:p>
-            <w:pPr>
-              <w:pStyle w:val="Normal"/>
-              <w:spacing w:before="300" w:after="0"/>
-              <w:jc w:val="center"/>
-              <w:rPr/>
-            </w:pPr>
-            <w:r>
-              <w:rPr>
-                <w:i/>
-                <w:color w:val="555555"/>
-                <w:sz w:val="22"/>
-              </w:rPr>
-              <w:t>[Chèn ảnh chụp màn hình]</w:t>
-              <w:br/>
-              <w:t>Giao diện quản lý vị trí và ứng viên</w:t>
-            </w:r>
-          </w:p>
-        </w:tc>
-      </w:tr>
-    </w:tbl>
+        <w:rPr/>
+      </w:pPr>
+      <w:r>
+        <w:rPr/>
+        <w:drawing>
+          <wp:inline distT="0" distB="0" distL="0" distR="0">
+            <wp:extent cx="5579745" cy="3268345"/>
+            <wp:effectExtent l="0" t="0" r="0" b="0"/>
+            <wp:docPr id="12" name="Picture 12" descr=""/>
+            <wp:cNvGraphicFramePr>
+              <a:graphicFrameLocks xmlns:a="http://schemas.openxmlformats.org/drawingml/2006/main" noChangeAspect="1"/>
+            </wp:cNvGraphicFramePr>
+            <a:graphic xmlns:a="http://schemas.openxmlformats.org/drawingml/2006/main">
+              <a:graphicData uri="http://schemas.openxmlformats.org/drawingml/2006/picture">
+                <pic:pic xmlns:pic="http://schemas.openxmlformats.org/drawingml/2006/picture">
+                  <pic:nvPicPr>
+                    <pic:cNvPr id="12" name="Picture 12" descr=""/>
+                    <pic:cNvPicPr>
+                      <a:picLocks noChangeAspect="1" noChangeArrowheads="1"/>
+                    </pic:cNvPicPr>
+                  </pic:nvPicPr>
+                  <pic:blipFill>
+                    <a:blip r:embed="rId13"/>
+                    <a:stretch>
+                      <a:fillRect/>
+                    </a:stretch>
+                  </pic:blipFill>
+                  <pic:spPr bwMode="auto">
+                    <a:xfrm>
+                      <a:off x="0" y="0"/>
+                      <a:ext cx="5579745" cy="3268345"/>
+                    </a:xfrm>
+                    <a:prstGeom prst="rect">
+                      <a:avLst/>
+                    </a:prstGeom>
+                  </pic:spPr>
+                </pic:pic>
+              </a:graphicData>
+            </a:graphic>
+          </wp:inline>
+        </w:drawing>
+      </w:r>
+    </w:p>
     <w:p>
       <w:pPr>
         <w:pStyle w:val="Caption"/>
         <w:rPr/>
       </w:pPr>
-      <w:bookmarkStart w:id="59" w:name="__RefHeading___Toc1503_2949742311"/>
+      <w:bookmarkStart w:id="59" w:name="__RefHeading___Toc1423_2376024671"/>
       <w:bookmarkEnd w:id="59"/>
       <w:r>
         <w:rPr>
@@ -14422,66 +14387,61 @@
         <w:t>Nhiệm vụ dạng kanban: lọc theo sinh viên, tìm kiếm, lọc việc chờ xác nhận.</w:t>
       </w:r>
     </w:p>
-    <w:tbl>
-      <w:tblPr>
-        <w:tblW w:w="9071" w:type="dxa"/>
+    <w:p>
+      <w:pPr>
+        <w:pStyle w:val="Normal"/>
+        <w:keepNext w:val="true"/>
+        <w:spacing w:before="0" w:after="40"/>
         <w:jc w:val="center"/>
-        <w:tblInd w:w="0" w:type="dxa"/>
-        <w:tblLayout w:type="fixed"/>
-        <w:tblCellMar>
-          <w:top w:w="0" w:type="dxa"/>
-          <w:left w:w="108" w:type="dxa"/>
-          <w:bottom w:w="0" w:type="dxa"/>
-          <w:right w:w="108" w:type="dxa"/>
-        </w:tblCellMar>
-        <w:tblLook w:val="04a0" w:noHBand="0" w:noVBand="1" w:firstColumn="1" w:lastRow="0" w:lastColumn="0" w:firstRow="1"/>
-      </w:tblPr>
-      <w:tblGrid>
-        <w:gridCol w:w="9071"/>
-      </w:tblGrid>
-      <w:tr>
-        <w:trPr>
-          <w:trHeight w:val="2835" w:hRule="atLeast"/>
-        </w:trPr>
-        <w:tc>
-          <w:tcPr>
-            <w:tcW w:w="9071" w:type="dxa"/>
-            <w:tcBorders>
-              <w:top w:val="single" w:sz="4" w:space="0" w:color="000000"/>
-              <w:left w:val="single" w:sz="4" w:space="0" w:color="000000"/>
-              <w:bottom w:val="single" w:sz="4" w:space="0" w:color="000000"/>
-              <w:right w:val="single" w:sz="4" w:space="0" w:color="000000"/>
-            </w:tcBorders>
-            <w:shd w:color="auto" w:fill="F2F2F2" w:val="clear"/>
-            <w:vAlign w:val="center"/>
-          </w:tcPr>
-          <w:p>
-            <w:pPr>
-              <w:pStyle w:val="Normal"/>
-              <w:spacing w:before="300" w:after="0"/>
-              <w:jc w:val="center"/>
-              <w:rPr/>
-            </w:pPr>
-            <w:r>
-              <w:rPr>
-                <w:i/>
-                <w:color w:val="555555"/>
-                <w:sz w:val="22"/>
-              </w:rPr>
-              <w:t>[Chèn ảnh chụp màn hình]</w:t>
-              <w:br/>
-              <w:t>Giao diện bảng kanban nhiệm vụ</w:t>
-            </w:r>
-          </w:p>
-        </w:tc>
-      </w:tr>
-    </w:tbl>
+        <w:rPr/>
+      </w:pPr>
+      <w:r>
+        <w:rPr/>
+        <w:drawing>
+          <wp:inline distT="0" distB="0" distL="0" distR="0">
+            <wp:extent cx="5579745" cy="3268345"/>
+            <wp:effectExtent l="0" t="0" r="0" b="0"/>
+            <wp:docPr id="13" name="Picture 13" descr=""/>
+            <wp:cNvGraphicFramePr>
+              <a:graphicFrameLocks xmlns:a="http://schemas.openxmlformats.org/drawingml/2006/main" noChangeAspect="1"/>
+            </wp:cNvGraphicFramePr>
+            <a:graphic xmlns:a="http://schemas.openxmlformats.org/drawingml/2006/main">
+              <a:graphicData uri="http://schemas.openxmlformats.org/drawingml/2006/picture">
+                <pic:pic xmlns:pic="http://schemas.openxmlformats.org/drawingml/2006/picture">
+                  <pic:nvPicPr>
+                    <pic:cNvPr id="13" name="Picture 13" descr=""/>
+                    <pic:cNvPicPr>
+                      <a:picLocks noChangeAspect="1" noChangeArrowheads="1"/>
+                    </pic:cNvPicPr>
+                  </pic:nvPicPr>
+                  <pic:blipFill>
+                    <a:blip r:embed="rId14"/>
+                    <a:stretch>
+                      <a:fillRect/>
+                    </a:stretch>
+                  </pic:blipFill>
+                  <pic:spPr bwMode="auto">
+                    <a:xfrm>
+                      <a:off x="0" y="0"/>
+                      <a:ext cx="5579745" cy="3268345"/>
+                    </a:xfrm>
+                    <a:prstGeom prst="rect">
+                      <a:avLst/>
+                    </a:prstGeom>
+                  </pic:spPr>
+                </pic:pic>
+              </a:graphicData>
+            </a:graphic>
+          </wp:inline>
+        </w:drawing>
+      </w:r>
+    </w:p>
     <w:p>
       <w:pPr>
         <w:pStyle w:val="Caption"/>
         <w:rPr/>
       </w:pPr>
-      <w:bookmarkStart w:id="60" w:name="__RefHeading___Toc1501_2949742311"/>
+      <w:bookmarkStart w:id="60" w:name="__RefHeading___Toc1421_2376024671"/>
       <w:bookmarkEnd w:id="60"/>
       <w:r>
         <w:rPr>
@@ -14507,69 +14467,64 @@
           <w:b w:val="false"/>
           <w:i w:val="false"/>
         </w:rPr>
-        <w:t>Đánh giá thực tập sinh và xác nhận kỹ năng do AI đề xuất.</w:t>
-      </w:r>
-    </w:p>
-    <w:tbl>
-      <w:tblPr>
-        <w:tblW w:w="9071" w:type="dxa"/>
+        <w:t>Đánh giá năng lực thực tập sinh (lưu nháp, gửi, điều chỉnh); kỹ năng AI đề xuất được xác nhận ở mục Kỹ năng thực tập.</w:t>
+      </w:r>
+    </w:p>
+    <w:p>
+      <w:pPr>
+        <w:pStyle w:val="Normal"/>
+        <w:keepNext w:val="true"/>
+        <w:spacing w:before="0" w:after="40"/>
         <w:jc w:val="center"/>
-        <w:tblInd w:w="0" w:type="dxa"/>
-        <w:tblLayout w:type="fixed"/>
-        <w:tblCellMar>
-          <w:top w:w="0" w:type="dxa"/>
-          <w:left w:w="108" w:type="dxa"/>
-          <w:bottom w:w="0" w:type="dxa"/>
-          <w:right w:w="108" w:type="dxa"/>
-        </w:tblCellMar>
-        <w:tblLook w:val="04a0" w:noHBand="0" w:noVBand="1" w:firstColumn="1" w:lastRow="0" w:lastColumn="0" w:firstRow="1"/>
-      </w:tblPr>
-      <w:tblGrid>
-        <w:gridCol w:w="9071"/>
-      </w:tblGrid>
-      <w:tr>
-        <w:trPr>
-          <w:trHeight w:val="2835" w:hRule="atLeast"/>
-        </w:trPr>
-        <w:tc>
-          <w:tcPr>
-            <w:tcW w:w="9071" w:type="dxa"/>
-            <w:tcBorders>
-              <w:top w:val="single" w:sz="4" w:space="0" w:color="000000"/>
-              <w:left w:val="single" w:sz="4" w:space="0" w:color="000000"/>
-              <w:bottom w:val="single" w:sz="4" w:space="0" w:color="000000"/>
-              <w:right w:val="single" w:sz="4" w:space="0" w:color="000000"/>
-            </w:tcBorders>
-            <w:shd w:color="auto" w:fill="F2F2F2" w:val="clear"/>
-            <w:vAlign w:val="center"/>
-          </w:tcPr>
-          <w:p>
-            <w:pPr>
-              <w:pStyle w:val="Normal"/>
-              <w:spacing w:before="300" w:after="0"/>
-              <w:jc w:val="center"/>
-              <w:rPr/>
-            </w:pPr>
-            <w:r>
-              <w:rPr>
-                <w:i/>
-                <w:color w:val="555555"/>
-                <w:sz w:val="22"/>
-              </w:rPr>
-              <w:t>[Chèn ảnh chụp màn hình]</w:t>
-              <w:br/>
-              <w:t>Giao diện đánh giá và kỹ năng thực tập</w:t>
-            </w:r>
-          </w:p>
-        </w:tc>
-      </w:tr>
-    </w:tbl>
+        <w:rPr/>
+      </w:pPr>
+      <w:r>
+        <w:rPr/>
+        <w:drawing>
+          <wp:inline distT="0" distB="0" distL="0" distR="0">
+            <wp:extent cx="5579745" cy="3268345"/>
+            <wp:effectExtent l="0" t="0" r="0" b="0"/>
+            <wp:docPr id="14" name="Picture 14" descr=""/>
+            <wp:cNvGraphicFramePr>
+              <a:graphicFrameLocks xmlns:a="http://schemas.openxmlformats.org/drawingml/2006/main" noChangeAspect="1"/>
+            </wp:cNvGraphicFramePr>
+            <a:graphic xmlns:a="http://schemas.openxmlformats.org/drawingml/2006/main">
+              <a:graphicData uri="http://schemas.openxmlformats.org/drawingml/2006/picture">
+                <pic:pic xmlns:pic="http://schemas.openxmlformats.org/drawingml/2006/picture">
+                  <pic:nvPicPr>
+                    <pic:cNvPr id="14" name="Picture 14" descr=""/>
+                    <pic:cNvPicPr>
+                      <a:picLocks noChangeAspect="1" noChangeArrowheads="1"/>
+                    </pic:cNvPicPr>
+                  </pic:nvPicPr>
+                  <pic:blipFill>
+                    <a:blip r:embed="rId15"/>
+                    <a:stretch>
+                      <a:fillRect/>
+                    </a:stretch>
+                  </pic:blipFill>
+                  <pic:spPr bwMode="auto">
+                    <a:xfrm>
+                      <a:off x="0" y="0"/>
+                      <a:ext cx="5579745" cy="3268345"/>
+                    </a:xfrm>
+                    <a:prstGeom prst="rect">
+                      <a:avLst/>
+                    </a:prstGeom>
+                  </pic:spPr>
+                </pic:pic>
+              </a:graphicData>
+            </a:graphic>
+          </wp:inline>
+        </w:drawing>
+      </w:r>
+    </w:p>
     <w:p>
       <w:pPr>
         <w:pStyle w:val="Caption"/>
         <w:rPr/>
       </w:pPr>
-      <w:bookmarkStart w:id="61" w:name="__RefHeading___Toc1499_2949742311"/>
+      <w:bookmarkStart w:id="61" w:name="__RefHeading___Toc1419_2376024671"/>
       <w:bookmarkEnd w:id="61"/>
       <w:r>
         <w:rPr>
@@ -14578,7 +14533,7 @@
           <w:color w:val="000000"/>
           <w:sz w:val="24"/>
         </w:rPr>
-        <w:t>Hình 3.9. Giao diện đánh giá và kỹ năng thực tập</w:t>
+        <w:t>Hình 3.9. Giao diện đánh giá năng lực thực tập sinh</w:t>
       </w:r>
     </w:p>
     <w:p>
@@ -14586,7 +14541,7 @@
         <w:pStyle w:val="Heading3"/>
         <w:rPr/>
       </w:pPr>
-      <w:bookmarkStart w:id="62" w:name="__RefHeading___Toc1469_2949742311"/>
+      <w:bookmarkStart w:id="62" w:name="__RefHeading___Toc1389_2376024671"/>
       <w:bookmarkEnd w:id="62"/>
       <w:r>
         <w:rPr/>
@@ -14610,66 +14565,61 @@
         <w:t>Danh sách sinh viên, duyệt nhật ký/báo cáo với nút “AI tóm tắt”.</w:t>
       </w:r>
     </w:p>
-    <w:tbl>
-      <w:tblPr>
-        <w:tblW w:w="9071" w:type="dxa"/>
+    <w:p>
+      <w:pPr>
+        <w:pStyle w:val="Normal"/>
+        <w:keepNext w:val="true"/>
+        <w:spacing w:before="0" w:after="40"/>
         <w:jc w:val="center"/>
-        <w:tblInd w:w="0" w:type="dxa"/>
-        <w:tblLayout w:type="fixed"/>
-        <w:tblCellMar>
-          <w:top w:w="0" w:type="dxa"/>
-          <w:left w:w="108" w:type="dxa"/>
-          <w:bottom w:w="0" w:type="dxa"/>
-          <w:right w:w="108" w:type="dxa"/>
-        </w:tblCellMar>
-        <w:tblLook w:val="04a0" w:noHBand="0" w:noVBand="1" w:firstColumn="1" w:lastRow="0" w:lastColumn="0" w:firstRow="1"/>
-      </w:tblPr>
-      <w:tblGrid>
-        <w:gridCol w:w="9071"/>
-      </w:tblGrid>
-      <w:tr>
-        <w:trPr>
-          <w:trHeight w:val="2835" w:hRule="atLeast"/>
-        </w:trPr>
-        <w:tc>
-          <w:tcPr>
-            <w:tcW w:w="9071" w:type="dxa"/>
-            <w:tcBorders>
-              <w:top w:val="single" w:sz="4" w:space="0" w:color="000000"/>
-              <w:left w:val="single" w:sz="4" w:space="0" w:color="000000"/>
-              <w:bottom w:val="single" w:sz="4" w:space="0" w:color="000000"/>
-              <w:right w:val="single" w:sz="4" w:space="0" w:color="000000"/>
-            </w:tcBorders>
-            <w:shd w:color="auto" w:fill="F2F2F2" w:val="clear"/>
-            <w:vAlign w:val="center"/>
-          </w:tcPr>
-          <w:p>
-            <w:pPr>
-              <w:pStyle w:val="Normal"/>
-              <w:spacing w:before="300" w:after="0"/>
-              <w:jc w:val="center"/>
-              <w:rPr/>
-            </w:pPr>
-            <w:r>
-              <w:rPr>
-                <w:i/>
-                <w:color w:val="555555"/>
-                <w:sz w:val="22"/>
-              </w:rPr>
-              <w:t>[Chèn ảnh chụp màn hình]</w:t>
-              <w:br/>
-              <w:t>Giao diện duyệt nhật ký và tóm tắt AI</w:t>
-            </w:r>
-          </w:p>
-        </w:tc>
-      </w:tr>
-    </w:tbl>
+        <w:rPr/>
+      </w:pPr>
+      <w:r>
+        <w:rPr/>
+        <w:drawing>
+          <wp:inline distT="0" distB="0" distL="0" distR="0">
+            <wp:extent cx="5579745" cy="3268345"/>
+            <wp:effectExtent l="0" t="0" r="0" b="0"/>
+            <wp:docPr id="15" name="Picture 15" descr=""/>
+            <wp:cNvGraphicFramePr>
+              <a:graphicFrameLocks xmlns:a="http://schemas.openxmlformats.org/drawingml/2006/main" noChangeAspect="1"/>
+            </wp:cNvGraphicFramePr>
+            <a:graphic xmlns:a="http://schemas.openxmlformats.org/drawingml/2006/main">
+              <a:graphicData uri="http://schemas.openxmlformats.org/drawingml/2006/picture">
+                <pic:pic xmlns:pic="http://schemas.openxmlformats.org/drawingml/2006/picture">
+                  <pic:nvPicPr>
+                    <pic:cNvPr id="15" name="Picture 15" descr=""/>
+                    <pic:cNvPicPr>
+                      <a:picLocks noChangeAspect="1" noChangeArrowheads="1"/>
+                    </pic:cNvPicPr>
+                  </pic:nvPicPr>
+                  <pic:blipFill>
+                    <a:blip r:embed="rId16"/>
+                    <a:stretch>
+                      <a:fillRect/>
+                    </a:stretch>
+                  </pic:blipFill>
+                  <pic:spPr bwMode="auto">
+                    <a:xfrm>
+                      <a:off x="0" y="0"/>
+                      <a:ext cx="5579745" cy="3268345"/>
+                    </a:xfrm>
+                    <a:prstGeom prst="rect">
+                      <a:avLst/>
+                    </a:prstGeom>
+                  </pic:spPr>
+                </pic:pic>
+              </a:graphicData>
+            </a:graphic>
+          </wp:inline>
+        </w:drawing>
+      </w:r>
+    </w:p>
     <w:p>
       <w:pPr>
         <w:pStyle w:val="Caption"/>
         <w:rPr/>
       </w:pPr>
-      <w:bookmarkStart w:id="63" w:name="__RefHeading___Toc1497_2949742311"/>
+      <w:bookmarkStart w:id="63" w:name="__RefHeading___Toc1417_2376024671"/>
       <w:bookmarkEnd w:id="63"/>
       <w:r>
         <w:rPr>
@@ -14698,66 +14648,61 @@
         <w:t>Trang Tiến độ: cảnh báo sớm sinh viên có nguy cơ kèm gợi ý can thiệp.</w:t>
       </w:r>
     </w:p>
-    <w:tbl>
-      <w:tblPr>
-        <w:tblW w:w="9071" w:type="dxa"/>
+    <w:p>
+      <w:pPr>
+        <w:pStyle w:val="Normal"/>
+        <w:keepNext w:val="true"/>
+        <w:spacing w:before="0" w:after="40"/>
         <w:jc w:val="center"/>
-        <w:tblInd w:w="0" w:type="dxa"/>
-        <w:tblLayout w:type="fixed"/>
-        <w:tblCellMar>
-          <w:top w:w="0" w:type="dxa"/>
-          <w:left w:w="108" w:type="dxa"/>
-          <w:bottom w:w="0" w:type="dxa"/>
-          <w:right w:w="108" w:type="dxa"/>
-        </w:tblCellMar>
-        <w:tblLook w:val="04a0" w:noHBand="0" w:noVBand="1" w:firstColumn="1" w:lastRow="0" w:lastColumn="0" w:firstRow="1"/>
-      </w:tblPr>
-      <w:tblGrid>
-        <w:gridCol w:w="9071"/>
-      </w:tblGrid>
-      <w:tr>
-        <w:trPr>
-          <w:trHeight w:val="2835" w:hRule="atLeast"/>
-        </w:trPr>
-        <w:tc>
-          <w:tcPr>
-            <w:tcW w:w="9071" w:type="dxa"/>
-            <w:tcBorders>
-              <w:top w:val="single" w:sz="4" w:space="0" w:color="000000"/>
-              <w:left w:val="single" w:sz="4" w:space="0" w:color="000000"/>
-              <w:bottom w:val="single" w:sz="4" w:space="0" w:color="000000"/>
-              <w:right w:val="single" w:sz="4" w:space="0" w:color="000000"/>
-            </w:tcBorders>
-            <w:shd w:color="auto" w:fill="F2F2F2" w:val="clear"/>
-            <w:vAlign w:val="center"/>
-          </w:tcPr>
-          <w:p>
-            <w:pPr>
-              <w:pStyle w:val="Normal"/>
-              <w:spacing w:before="300" w:after="0"/>
-              <w:jc w:val="center"/>
-              <w:rPr/>
-            </w:pPr>
-            <w:r>
-              <w:rPr>
-                <w:i/>
-                <w:color w:val="555555"/>
-                <w:sz w:val="22"/>
-              </w:rPr>
-              <w:t>[Chèn ảnh chụp màn hình]</w:t>
-              <w:br/>
-              <w:t>Giao diện cảnh báo rủi ro</w:t>
-            </w:r>
-          </w:p>
-        </w:tc>
-      </w:tr>
-    </w:tbl>
+        <w:rPr/>
+      </w:pPr>
+      <w:r>
+        <w:rPr/>
+        <w:drawing>
+          <wp:inline distT="0" distB="0" distL="0" distR="0">
+            <wp:extent cx="5579745" cy="3268345"/>
+            <wp:effectExtent l="0" t="0" r="0" b="0"/>
+            <wp:docPr id="16" name="Picture 16" descr=""/>
+            <wp:cNvGraphicFramePr>
+              <a:graphicFrameLocks xmlns:a="http://schemas.openxmlformats.org/drawingml/2006/main" noChangeAspect="1"/>
+            </wp:cNvGraphicFramePr>
+            <a:graphic xmlns:a="http://schemas.openxmlformats.org/drawingml/2006/main">
+              <a:graphicData uri="http://schemas.openxmlformats.org/drawingml/2006/picture">
+                <pic:pic xmlns:pic="http://schemas.openxmlformats.org/drawingml/2006/picture">
+                  <pic:nvPicPr>
+                    <pic:cNvPr id="16" name="Picture 16" descr=""/>
+                    <pic:cNvPicPr>
+                      <a:picLocks noChangeAspect="1" noChangeArrowheads="1"/>
+                    </pic:cNvPicPr>
+                  </pic:nvPicPr>
+                  <pic:blipFill>
+                    <a:blip r:embed="rId17"/>
+                    <a:stretch>
+                      <a:fillRect/>
+                    </a:stretch>
+                  </pic:blipFill>
+                  <pic:spPr bwMode="auto">
+                    <a:xfrm>
+                      <a:off x="0" y="0"/>
+                      <a:ext cx="5579745" cy="3268345"/>
+                    </a:xfrm>
+                    <a:prstGeom prst="rect">
+                      <a:avLst/>
+                    </a:prstGeom>
+                  </pic:spPr>
+                </pic:pic>
+              </a:graphicData>
+            </a:graphic>
+          </wp:inline>
+        </w:drawing>
+      </w:r>
+    </w:p>
     <w:p>
       <w:pPr>
         <w:pStyle w:val="Caption"/>
         <w:rPr/>
       </w:pPr>
-      <w:bookmarkStart w:id="64" w:name="__RefHeading___Toc1495_2949742311"/>
+      <w:bookmarkStart w:id="64" w:name="__RefHeading___Toc1415_2376024671"/>
       <w:bookmarkEnd w:id="64"/>
       <w:r>
         <w:rPr>
@@ -14786,66 +14731,61 @@
         <w:t>Đánh giá: AI soạn nhận xét cuối kỳ từ đánh giá đã gửi.</w:t>
       </w:r>
     </w:p>
-    <w:tbl>
-      <w:tblPr>
-        <w:tblW w:w="9071" w:type="dxa"/>
+    <w:p>
+      <w:pPr>
+        <w:pStyle w:val="Normal"/>
+        <w:keepNext w:val="true"/>
+        <w:spacing w:before="0" w:after="40"/>
         <w:jc w:val="center"/>
-        <w:tblInd w:w="0" w:type="dxa"/>
-        <w:tblLayout w:type="fixed"/>
-        <w:tblCellMar>
-          <w:top w:w="0" w:type="dxa"/>
-          <w:left w:w="108" w:type="dxa"/>
-          <w:bottom w:w="0" w:type="dxa"/>
-          <w:right w:w="108" w:type="dxa"/>
-        </w:tblCellMar>
-        <w:tblLook w:val="04a0" w:noHBand="0" w:noVBand="1" w:firstColumn="1" w:lastRow="0" w:lastColumn="0" w:firstRow="1"/>
-      </w:tblPr>
-      <w:tblGrid>
-        <w:gridCol w:w="9071"/>
-      </w:tblGrid>
-      <w:tr>
-        <w:trPr>
-          <w:trHeight w:val="2835" w:hRule="atLeast"/>
-        </w:trPr>
-        <w:tc>
-          <w:tcPr>
-            <w:tcW w:w="9071" w:type="dxa"/>
-            <w:tcBorders>
-              <w:top w:val="single" w:sz="4" w:space="0" w:color="000000"/>
-              <w:left w:val="single" w:sz="4" w:space="0" w:color="000000"/>
-              <w:bottom w:val="single" w:sz="4" w:space="0" w:color="000000"/>
-              <w:right w:val="single" w:sz="4" w:space="0" w:color="000000"/>
-            </w:tcBorders>
-            <w:shd w:color="auto" w:fill="F2F2F2" w:val="clear"/>
-            <w:vAlign w:val="center"/>
-          </w:tcPr>
-          <w:p>
-            <w:pPr>
-              <w:pStyle w:val="Normal"/>
-              <w:spacing w:before="300" w:after="0"/>
-              <w:jc w:val="center"/>
-              <w:rPr/>
-            </w:pPr>
-            <w:r>
-              <w:rPr>
-                <w:i/>
-                <w:color w:val="555555"/>
-                <w:sz w:val="22"/>
-              </w:rPr>
-              <w:t>[Chèn ảnh chụp màn hình]</w:t>
-              <w:br/>
-              <w:t>Giao diện nhận xét cuối kỳ</w:t>
-            </w:r>
-          </w:p>
-        </w:tc>
-      </w:tr>
-    </w:tbl>
+        <w:rPr/>
+      </w:pPr>
+      <w:r>
+        <w:rPr/>
+        <w:drawing>
+          <wp:inline distT="0" distB="0" distL="0" distR="0">
+            <wp:extent cx="5579745" cy="3268345"/>
+            <wp:effectExtent l="0" t="0" r="0" b="0"/>
+            <wp:docPr id="17" name="Picture 17" descr=""/>
+            <wp:cNvGraphicFramePr>
+              <a:graphicFrameLocks xmlns:a="http://schemas.openxmlformats.org/drawingml/2006/main" noChangeAspect="1"/>
+            </wp:cNvGraphicFramePr>
+            <a:graphic xmlns:a="http://schemas.openxmlformats.org/drawingml/2006/main">
+              <a:graphicData uri="http://schemas.openxmlformats.org/drawingml/2006/picture">
+                <pic:pic xmlns:pic="http://schemas.openxmlformats.org/drawingml/2006/picture">
+                  <pic:nvPicPr>
+                    <pic:cNvPr id="17" name="Picture 17" descr=""/>
+                    <pic:cNvPicPr>
+                      <a:picLocks noChangeAspect="1" noChangeArrowheads="1"/>
+                    </pic:cNvPicPr>
+                  </pic:nvPicPr>
+                  <pic:blipFill>
+                    <a:blip r:embed="rId18"/>
+                    <a:stretch>
+                      <a:fillRect/>
+                    </a:stretch>
+                  </pic:blipFill>
+                  <pic:spPr bwMode="auto">
+                    <a:xfrm>
+                      <a:off x="0" y="0"/>
+                      <a:ext cx="5579745" cy="3268345"/>
+                    </a:xfrm>
+                    <a:prstGeom prst="rect">
+                      <a:avLst/>
+                    </a:prstGeom>
+                  </pic:spPr>
+                </pic:pic>
+              </a:graphicData>
+            </a:graphic>
+          </wp:inline>
+        </w:drawing>
+      </w:r>
+    </w:p>
     <w:p>
       <w:pPr>
         <w:pStyle w:val="Caption"/>
         <w:rPr/>
       </w:pPr>
-      <w:bookmarkStart w:id="65" w:name="__RefHeading___Toc1493_2949742311"/>
+      <w:bookmarkStart w:id="65" w:name="__RefHeading___Toc1413_2376024671"/>
       <w:bookmarkEnd w:id="65"/>
       <w:r>
         <w:rPr>
@@ -14862,7 +14802,7 @@
         <w:pStyle w:val="Heading3"/>
         <w:rPr/>
       </w:pPr>
-      <w:bookmarkStart w:id="66" w:name="__RefHeading___Toc1471_2949742311"/>
+      <w:bookmarkStart w:id="66" w:name="__RefHeading___Toc1391_2376024671"/>
       <w:bookmarkEnd w:id="66"/>
       <w:r>
         <w:rPr/>
@@ -14886,66 +14826,61 @@
         <w:t>Bảng điều khiển: thống kê và kỹ năng doanh nghiệp đang cần do AI tổng hợp.</w:t>
       </w:r>
     </w:p>
-    <w:tbl>
-      <w:tblPr>
-        <w:tblW w:w="9071" w:type="dxa"/>
+    <w:p>
+      <w:pPr>
+        <w:pStyle w:val="Normal"/>
+        <w:keepNext w:val="true"/>
+        <w:spacing w:before="0" w:after="40"/>
         <w:jc w:val="center"/>
-        <w:tblInd w:w="0" w:type="dxa"/>
-        <w:tblLayout w:type="fixed"/>
-        <w:tblCellMar>
-          <w:top w:w="0" w:type="dxa"/>
-          <w:left w:w="108" w:type="dxa"/>
-          <w:bottom w:w="0" w:type="dxa"/>
-          <w:right w:w="108" w:type="dxa"/>
-        </w:tblCellMar>
-        <w:tblLook w:val="04a0" w:noHBand="0" w:noVBand="1" w:firstColumn="1" w:lastRow="0" w:lastColumn="0" w:firstRow="1"/>
-      </w:tblPr>
-      <w:tblGrid>
-        <w:gridCol w:w="9071"/>
-      </w:tblGrid>
-      <w:tr>
-        <w:trPr>
-          <w:trHeight w:val="2835" w:hRule="atLeast"/>
-        </w:trPr>
-        <w:tc>
-          <w:tcPr>
-            <w:tcW w:w="9071" w:type="dxa"/>
-            <w:tcBorders>
-              <w:top w:val="single" w:sz="4" w:space="0" w:color="000000"/>
-              <w:left w:val="single" w:sz="4" w:space="0" w:color="000000"/>
-              <w:bottom w:val="single" w:sz="4" w:space="0" w:color="000000"/>
-              <w:right w:val="single" w:sz="4" w:space="0" w:color="000000"/>
-            </w:tcBorders>
-            <w:shd w:color="auto" w:fill="F2F2F2" w:val="clear"/>
-            <w:vAlign w:val="center"/>
-          </w:tcPr>
-          <w:p>
-            <w:pPr>
-              <w:pStyle w:val="Normal"/>
-              <w:spacing w:before="300" w:after="0"/>
-              <w:jc w:val="center"/>
-              <w:rPr/>
-            </w:pPr>
-            <w:r>
-              <w:rPr>
-                <w:i/>
-                <w:color w:val="555555"/>
-                <w:sz w:val="22"/>
-              </w:rPr>
-              <w:t>[Chèn ảnh chụp màn hình]</w:t>
-              <w:br/>
-              <w:t>Giao diện bảng điều khiển quản trị</w:t>
-            </w:r>
-          </w:p>
-        </w:tc>
-      </w:tr>
-    </w:tbl>
+        <w:rPr/>
+      </w:pPr>
+      <w:r>
+        <w:rPr/>
+        <w:drawing>
+          <wp:inline distT="0" distB="0" distL="0" distR="0">
+            <wp:extent cx="5579745" cy="3268345"/>
+            <wp:effectExtent l="0" t="0" r="0" b="0"/>
+            <wp:docPr id="18" name="Picture 18" descr=""/>
+            <wp:cNvGraphicFramePr>
+              <a:graphicFrameLocks xmlns:a="http://schemas.openxmlformats.org/drawingml/2006/main" noChangeAspect="1"/>
+            </wp:cNvGraphicFramePr>
+            <a:graphic xmlns:a="http://schemas.openxmlformats.org/drawingml/2006/main">
+              <a:graphicData uri="http://schemas.openxmlformats.org/drawingml/2006/picture">
+                <pic:pic xmlns:pic="http://schemas.openxmlformats.org/drawingml/2006/picture">
+                  <pic:nvPicPr>
+                    <pic:cNvPr id="18" name="Picture 18" descr=""/>
+                    <pic:cNvPicPr>
+                      <a:picLocks noChangeAspect="1" noChangeArrowheads="1"/>
+                    </pic:cNvPicPr>
+                  </pic:nvPicPr>
+                  <pic:blipFill>
+                    <a:blip r:embed="rId19"/>
+                    <a:stretch>
+                      <a:fillRect/>
+                    </a:stretch>
+                  </pic:blipFill>
+                  <pic:spPr bwMode="auto">
+                    <a:xfrm>
+                      <a:off x="0" y="0"/>
+                      <a:ext cx="5579745" cy="3268345"/>
+                    </a:xfrm>
+                    <a:prstGeom prst="rect">
+                      <a:avLst/>
+                    </a:prstGeom>
+                  </pic:spPr>
+                </pic:pic>
+              </a:graphicData>
+            </a:graphic>
+          </wp:inline>
+        </w:drawing>
+      </w:r>
+    </w:p>
     <w:p>
       <w:pPr>
         <w:pStyle w:val="Caption"/>
         <w:rPr/>
       </w:pPr>
-      <w:bookmarkStart w:id="67" w:name="__RefHeading___Toc1491_2949742311"/>
+      <w:bookmarkStart w:id="67" w:name="__RefHeading___Toc1411_2376024671"/>
       <w:bookmarkEnd w:id="67"/>
       <w:r>
         <w:rPr>
@@ -14974,66 +14909,61 @@
         <w:t>Quản lý tài khoản và xác minh doanh nghiệp.</w:t>
       </w:r>
     </w:p>
-    <w:tbl>
-      <w:tblPr>
-        <w:tblW w:w="9071" w:type="dxa"/>
+    <w:p>
+      <w:pPr>
+        <w:pStyle w:val="Normal"/>
+        <w:keepNext w:val="true"/>
+        <w:spacing w:before="0" w:after="40"/>
         <w:jc w:val="center"/>
-        <w:tblInd w:w="0" w:type="dxa"/>
-        <w:tblLayout w:type="fixed"/>
-        <w:tblCellMar>
-          <w:top w:w="0" w:type="dxa"/>
-          <w:left w:w="108" w:type="dxa"/>
-          <w:bottom w:w="0" w:type="dxa"/>
-          <w:right w:w="108" w:type="dxa"/>
-        </w:tblCellMar>
-        <w:tblLook w:val="04a0" w:noHBand="0" w:noVBand="1" w:firstColumn="1" w:lastRow="0" w:lastColumn="0" w:firstRow="1"/>
-      </w:tblPr>
-      <w:tblGrid>
-        <w:gridCol w:w="9071"/>
-      </w:tblGrid>
-      <w:tr>
-        <w:trPr>
-          <w:trHeight w:val="2835" w:hRule="atLeast"/>
-        </w:trPr>
-        <w:tc>
-          <w:tcPr>
-            <w:tcW w:w="9071" w:type="dxa"/>
-            <w:tcBorders>
-              <w:top w:val="single" w:sz="4" w:space="0" w:color="000000"/>
-              <w:left w:val="single" w:sz="4" w:space="0" w:color="000000"/>
-              <w:bottom w:val="single" w:sz="4" w:space="0" w:color="000000"/>
-              <w:right w:val="single" w:sz="4" w:space="0" w:color="000000"/>
-            </w:tcBorders>
-            <w:shd w:color="auto" w:fill="F2F2F2" w:val="clear"/>
-            <w:vAlign w:val="center"/>
-          </w:tcPr>
-          <w:p>
-            <w:pPr>
-              <w:pStyle w:val="Normal"/>
-              <w:spacing w:before="300" w:after="0"/>
-              <w:jc w:val="center"/>
-              <w:rPr/>
-            </w:pPr>
-            <w:r>
-              <w:rPr>
-                <w:i/>
-                <w:color w:val="555555"/>
-                <w:sz w:val="22"/>
-              </w:rPr>
-              <w:t>[Chèn ảnh chụp màn hình]</w:t>
-              <w:br/>
-              <w:t>Giao diện quản lý tài khoản</w:t>
-            </w:r>
-          </w:p>
-        </w:tc>
-      </w:tr>
-    </w:tbl>
+        <w:rPr/>
+      </w:pPr>
+      <w:r>
+        <w:rPr/>
+        <w:drawing>
+          <wp:inline distT="0" distB="0" distL="0" distR="0">
+            <wp:extent cx="5579745" cy="3268345"/>
+            <wp:effectExtent l="0" t="0" r="0" b="0"/>
+            <wp:docPr id="19" name="Picture 19" descr=""/>
+            <wp:cNvGraphicFramePr>
+              <a:graphicFrameLocks xmlns:a="http://schemas.openxmlformats.org/drawingml/2006/main" noChangeAspect="1"/>
+            </wp:cNvGraphicFramePr>
+            <a:graphic xmlns:a="http://schemas.openxmlformats.org/drawingml/2006/main">
+              <a:graphicData uri="http://schemas.openxmlformats.org/drawingml/2006/picture">
+                <pic:pic xmlns:pic="http://schemas.openxmlformats.org/drawingml/2006/picture">
+                  <pic:nvPicPr>
+                    <pic:cNvPr id="19" name="Picture 19" descr=""/>
+                    <pic:cNvPicPr>
+                      <a:picLocks noChangeAspect="1" noChangeArrowheads="1"/>
+                    </pic:cNvPicPr>
+                  </pic:nvPicPr>
+                  <pic:blipFill>
+                    <a:blip r:embed="rId20"/>
+                    <a:stretch>
+                      <a:fillRect/>
+                    </a:stretch>
+                  </pic:blipFill>
+                  <pic:spPr bwMode="auto">
+                    <a:xfrm>
+                      <a:off x="0" y="0"/>
+                      <a:ext cx="5579745" cy="3268345"/>
+                    </a:xfrm>
+                    <a:prstGeom prst="rect">
+                      <a:avLst/>
+                    </a:prstGeom>
+                  </pic:spPr>
+                </pic:pic>
+              </a:graphicData>
+            </a:graphic>
+          </wp:inline>
+        </w:drawing>
+      </w:r>
+    </w:p>
     <w:p>
       <w:pPr>
         <w:pStyle w:val="Caption"/>
         <w:rPr/>
       </w:pPr>
-      <w:bookmarkStart w:id="68" w:name="__RefHeading___Toc1489_2949742311"/>
+      <w:bookmarkStart w:id="68" w:name="__RefHeading___Toc1409_2376024671"/>
       <w:bookmarkEnd w:id="68"/>
       <w:r>
         <w:rPr>
@@ -15062,66 +14992,61 @@
         <w:t>Quản lý kỳ thực tập: phân công giảng viên, giao kế hoạch chung cho cả một ngành.</w:t>
       </w:r>
     </w:p>
-    <w:tbl>
-      <w:tblPr>
-        <w:tblW w:w="9071" w:type="dxa"/>
+    <w:p>
+      <w:pPr>
+        <w:pStyle w:val="Normal"/>
+        <w:keepNext w:val="true"/>
+        <w:spacing w:before="0" w:after="40"/>
         <w:jc w:val="center"/>
-        <w:tblInd w:w="0" w:type="dxa"/>
-        <w:tblLayout w:type="fixed"/>
-        <w:tblCellMar>
-          <w:top w:w="0" w:type="dxa"/>
-          <w:left w:w="108" w:type="dxa"/>
-          <w:bottom w:w="0" w:type="dxa"/>
-          <w:right w:w="108" w:type="dxa"/>
-        </w:tblCellMar>
-        <w:tblLook w:val="04a0" w:noHBand="0" w:noVBand="1" w:firstColumn="1" w:lastRow="0" w:lastColumn="0" w:firstRow="1"/>
-      </w:tblPr>
-      <w:tblGrid>
-        <w:gridCol w:w="9071"/>
-      </w:tblGrid>
-      <w:tr>
-        <w:trPr>
-          <w:trHeight w:val="2835" w:hRule="atLeast"/>
-        </w:trPr>
-        <w:tc>
-          <w:tcPr>
-            <w:tcW w:w="9071" w:type="dxa"/>
-            <w:tcBorders>
-              <w:top w:val="single" w:sz="4" w:space="0" w:color="000000"/>
-              <w:left w:val="single" w:sz="4" w:space="0" w:color="000000"/>
-              <w:bottom w:val="single" w:sz="4" w:space="0" w:color="000000"/>
-              <w:right w:val="single" w:sz="4" w:space="0" w:color="000000"/>
-            </w:tcBorders>
-            <w:shd w:color="auto" w:fill="F2F2F2" w:val="clear"/>
-            <w:vAlign w:val="center"/>
-          </w:tcPr>
-          <w:p>
-            <w:pPr>
-              <w:pStyle w:val="Normal"/>
-              <w:spacing w:before="300" w:after="0"/>
-              <w:jc w:val="center"/>
-              <w:rPr/>
-            </w:pPr>
-            <w:r>
-              <w:rPr>
-                <w:i/>
-                <w:color w:val="555555"/>
-                <w:sz w:val="22"/>
-              </w:rPr>
-              <w:t>[Chèn ảnh chụp màn hình]</w:t>
-              <w:br/>
-              <w:t>Giao diện quản lý kỳ thực tập</w:t>
-            </w:r>
-          </w:p>
-        </w:tc>
-      </w:tr>
-    </w:tbl>
+        <w:rPr/>
+      </w:pPr>
+      <w:r>
+        <w:rPr/>
+        <w:drawing>
+          <wp:inline distT="0" distB="0" distL="0" distR="0">
+            <wp:extent cx="5579745" cy="3268345"/>
+            <wp:effectExtent l="0" t="0" r="0" b="0"/>
+            <wp:docPr id="20" name="Picture 20" descr=""/>
+            <wp:cNvGraphicFramePr>
+              <a:graphicFrameLocks xmlns:a="http://schemas.openxmlformats.org/drawingml/2006/main" noChangeAspect="1"/>
+            </wp:cNvGraphicFramePr>
+            <a:graphic xmlns:a="http://schemas.openxmlformats.org/drawingml/2006/main">
+              <a:graphicData uri="http://schemas.openxmlformats.org/drawingml/2006/picture">
+                <pic:pic xmlns:pic="http://schemas.openxmlformats.org/drawingml/2006/picture">
+                  <pic:nvPicPr>
+                    <pic:cNvPr id="20" name="Picture 20" descr=""/>
+                    <pic:cNvPicPr>
+                      <a:picLocks noChangeAspect="1" noChangeArrowheads="1"/>
+                    </pic:cNvPicPr>
+                  </pic:nvPicPr>
+                  <pic:blipFill>
+                    <a:blip r:embed="rId21"/>
+                    <a:stretch>
+                      <a:fillRect/>
+                    </a:stretch>
+                  </pic:blipFill>
+                  <pic:spPr bwMode="auto">
+                    <a:xfrm>
+                      <a:off x="0" y="0"/>
+                      <a:ext cx="5579745" cy="3268345"/>
+                    </a:xfrm>
+                    <a:prstGeom prst="rect">
+                      <a:avLst/>
+                    </a:prstGeom>
+                  </pic:spPr>
+                </pic:pic>
+              </a:graphicData>
+            </a:graphic>
+          </wp:inline>
+        </w:drawing>
+      </w:r>
+    </w:p>
     <w:p>
       <w:pPr>
         <w:pStyle w:val="Caption"/>
         <w:rPr/>
       </w:pPr>
-      <w:bookmarkStart w:id="69" w:name="__RefHeading___Toc1487_2949742311"/>
+      <w:bookmarkStart w:id="69" w:name="__RefHeading___Toc1407_2376024671"/>
       <w:bookmarkEnd w:id="69"/>
       <w:r>
         <w:rPr>
@@ -15150,66 +15075,61 @@
         <w:t>Tài liệu khoa: dán nội dung hoặc tải tệp .txt/.md làm nguồn cho trợ lý hỏi đáp.</w:t>
       </w:r>
     </w:p>
-    <w:tbl>
-      <w:tblPr>
-        <w:tblW w:w="9071" w:type="dxa"/>
+    <w:p>
+      <w:pPr>
+        <w:pStyle w:val="Normal"/>
+        <w:keepNext w:val="true"/>
+        <w:spacing w:before="0" w:after="40"/>
         <w:jc w:val="center"/>
-        <w:tblInd w:w="0" w:type="dxa"/>
-        <w:tblLayout w:type="fixed"/>
-        <w:tblCellMar>
-          <w:top w:w="0" w:type="dxa"/>
-          <w:left w:w="108" w:type="dxa"/>
-          <w:bottom w:w="0" w:type="dxa"/>
-          <w:right w:w="108" w:type="dxa"/>
-        </w:tblCellMar>
-        <w:tblLook w:val="04a0" w:noHBand="0" w:noVBand="1" w:firstColumn="1" w:lastRow="0" w:lastColumn="0" w:firstRow="1"/>
-      </w:tblPr>
-      <w:tblGrid>
-        <w:gridCol w:w="9071"/>
-      </w:tblGrid>
-      <w:tr>
-        <w:trPr>
-          <w:trHeight w:val="2835" w:hRule="atLeast"/>
-        </w:trPr>
-        <w:tc>
-          <w:tcPr>
-            <w:tcW w:w="9071" w:type="dxa"/>
-            <w:tcBorders>
-              <w:top w:val="single" w:sz="4" w:space="0" w:color="000000"/>
-              <w:left w:val="single" w:sz="4" w:space="0" w:color="000000"/>
-              <w:bottom w:val="single" w:sz="4" w:space="0" w:color="000000"/>
-              <w:right w:val="single" w:sz="4" w:space="0" w:color="000000"/>
-            </w:tcBorders>
-            <w:shd w:color="auto" w:fill="F2F2F2" w:val="clear"/>
-            <w:vAlign w:val="center"/>
-          </w:tcPr>
-          <w:p>
-            <w:pPr>
-              <w:pStyle w:val="Normal"/>
-              <w:spacing w:before="300" w:after="0"/>
-              <w:jc w:val="center"/>
-              <w:rPr/>
-            </w:pPr>
-            <w:r>
-              <w:rPr>
-                <w:i/>
-                <w:color w:val="555555"/>
-                <w:sz w:val="22"/>
-              </w:rPr>
-              <w:t>[Chèn ảnh chụp màn hình]</w:t>
-              <w:br/>
-              <w:t>Giao diện quản lý tài liệu khoa</w:t>
-            </w:r>
-          </w:p>
-        </w:tc>
-      </w:tr>
-    </w:tbl>
+        <w:rPr/>
+      </w:pPr>
+      <w:r>
+        <w:rPr/>
+        <w:drawing>
+          <wp:inline distT="0" distB="0" distL="0" distR="0">
+            <wp:extent cx="5579745" cy="3268345"/>
+            <wp:effectExtent l="0" t="0" r="0" b="0"/>
+            <wp:docPr id="21" name="Picture 21" descr=""/>
+            <wp:cNvGraphicFramePr>
+              <a:graphicFrameLocks xmlns:a="http://schemas.openxmlformats.org/drawingml/2006/main" noChangeAspect="1"/>
+            </wp:cNvGraphicFramePr>
+            <a:graphic xmlns:a="http://schemas.openxmlformats.org/drawingml/2006/main">
+              <a:graphicData uri="http://schemas.openxmlformats.org/drawingml/2006/picture">
+                <pic:pic xmlns:pic="http://schemas.openxmlformats.org/drawingml/2006/picture">
+                  <pic:nvPicPr>
+                    <pic:cNvPr id="21" name="Picture 21" descr=""/>
+                    <pic:cNvPicPr>
+                      <a:picLocks noChangeAspect="1" noChangeArrowheads="1"/>
+                    </pic:cNvPicPr>
+                  </pic:nvPicPr>
+                  <pic:blipFill>
+                    <a:blip r:embed="rId22"/>
+                    <a:stretch>
+                      <a:fillRect/>
+                    </a:stretch>
+                  </pic:blipFill>
+                  <pic:spPr bwMode="auto">
+                    <a:xfrm>
+                      <a:off x="0" y="0"/>
+                      <a:ext cx="5579745" cy="3268345"/>
+                    </a:xfrm>
+                    <a:prstGeom prst="rect">
+                      <a:avLst/>
+                    </a:prstGeom>
+                  </pic:spPr>
+                </pic:pic>
+              </a:graphicData>
+            </a:graphic>
+          </wp:inline>
+        </w:drawing>
+      </w:r>
+    </w:p>
     <w:p>
       <w:pPr>
         <w:pStyle w:val="Caption"/>
         <w:rPr/>
       </w:pPr>
-      <w:bookmarkStart w:id="70" w:name="__RefHeading___Toc1485_2949742311"/>
+      <w:bookmarkStart w:id="70" w:name="__RefHeading___Toc1405_2376024671"/>
       <w:bookmarkEnd w:id="70"/>
       <w:r>
         <w:rPr>
@@ -15229,7 +15149,7 @@
         <w:pStyle w:val="Heading1"/>
         <w:rPr/>
       </w:pPr>
-      <w:bookmarkStart w:id="71" w:name="__RefHeading___Toc1473_2949742311"/>
+      <w:bookmarkStart w:id="71" w:name="__RefHeading___Toc1393_2376024671"/>
       <w:bookmarkEnd w:id="71"/>
       <w:r>
         <w:rPr/>
@@ -15241,7 +15161,7 @@
         <w:pStyle w:val="Heading2"/>
         <w:rPr/>
       </w:pPr>
-      <w:bookmarkStart w:id="72" w:name="__RefHeading___Toc1475_2949742311"/>
+      <w:bookmarkStart w:id="72" w:name="__RefHeading___Toc1395_2376024671"/>
       <w:bookmarkEnd w:id="72"/>
       <w:r>
         <w:rPr/>
@@ -15373,7 +15293,7 @@
         <w:pStyle w:val="Heading2"/>
         <w:rPr/>
       </w:pPr>
-      <w:bookmarkStart w:id="73" w:name="__RefHeading___Toc1477_2949742311"/>
+      <w:bookmarkStart w:id="73" w:name="__RefHeading___Toc1397_2376024671"/>
       <w:bookmarkEnd w:id="73"/>
       <w:r>
         <w:rPr/>
@@ -15505,7 +15425,7 @@
         <w:pStyle w:val="Heading2"/>
         <w:rPr/>
       </w:pPr>
-      <w:bookmarkStart w:id="74" w:name="__RefHeading___Toc1479_2949742311"/>
+      <w:bookmarkStart w:id="74" w:name="__RefHeading___Toc1399_2376024671"/>
       <w:bookmarkEnd w:id="74"/>
       <w:r>
         <w:rPr/>
@@ -15584,7 +15504,7 @@
         <w:pStyle w:val="Heading1"/>
         <w:rPr/>
       </w:pPr>
-      <w:bookmarkStart w:id="75" w:name="__RefHeading___Toc1481_2949742311"/>
+      <w:bookmarkStart w:id="75" w:name="__RefHeading___Toc1401_2376024671"/>
       <w:bookmarkEnd w:id="75"/>
       <w:r>
         <w:rPr/>
@@ -15727,9 +15647,9 @@
       </w:r>
     </w:p>
     <w:sectPr>
-      <w:footerReference w:type="even" r:id="rId7"/>
-      <w:footerReference w:type="default" r:id="rId8"/>
-      <w:footerReference w:type="first" r:id="rId9"/>
+      <w:footerReference w:type="even" r:id="rId23"/>
+      <w:footerReference w:type="default" r:id="rId24"/>
+      <w:footerReference w:type="first" r:id="rId25"/>
       <w:type w:val="nextPage"/>
       <w:pgSz w:w="11906" w:h="16838"/>
       <w:pgMar w:left="1701" w:right="1134" w:gutter="0" w:header="0" w:top="1418" w:footer="720" w:bottom="1418"/>
@@ -15770,7 +15690,7 @@
       <mc:AlternateContent>
         <mc:Choice Requires="wps">
           <w:drawing>
-            <wp:anchor behindDoc="1" distT="0" distB="0" distL="0" distR="0" simplePos="0" locked="0" layoutInCell="0" allowOverlap="1" relativeHeight="63" wp14:anchorId="673614A4">
+            <wp:anchor behindDoc="1" distT="0" distB="0" distL="0" distR="0" simplePos="0" locked="0" layoutInCell="0" allowOverlap="1" relativeHeight="83" wp14:anchorId="673614A4">
               <wp:simplePos x="0" y="0"/>
               <wp:positionH relativeFrom="margin">
                 <wp:align>right</wp:align>
@@ -15781,7 +15701,7 @@
               <wp:extent cx="401320" cy="285750"/>
               <wp:effectExtent l="0" t="0" r="0" b="0"/>
               <wp:wrapNone/>
-              <wp:docPr id="6" name="Rectangle 1"/>
+              <wp:docPr id="22" name="Rectangle 1"/>
               <a:graphic xmlns:a="http://schemas.openxmlformats.org/drawingml/2006/main">
                 <a:graphicData uri="http://schemas.microsoft.com/office/word/2010/wordprocessingShape">
                   <wps:wsp>
@@ -15873,7 +15793,7 @@
                                   <w:rFonts w:cs="Calibri" w:ascii="Calibri" w:hAnsi="Calibri"/>
                                   <w:color w:themeColor="text1" w:val="000000"/>
                                 </w:rPr>
-                                <w:t>29</w:t>
+                                <w:t>31</w:t>
                               </w:r>
                               <w:r>
                                 <w:rPr>
@@ -15960,7 +15880,7 @@
                             <w:rFonts w:cs="Calibri" w:ascii="Calibri" w:hAnsi="Calibri"/>
                             <w:color w:themeColor="text1" w:val="000000"/>
                           </w:rPr>
-                          <w:t>29</w:t>
+                          <w:t>31</w:t>
                         </w:r>
                         <w:r>
                           <w:rPr>
@@ -15984,7 +15904,7 @@
       <mc:AlternateContent>
         <mc:Choice Requires="wps">
           <w:drawing>
-            <wp:anchor behindDoc="1" distT="0" distB="0" distL="0" distR="0" simplePos="0" locked="0" layoutInCell="1" allowOverlap="1" relativeHeight="93" wp14:anchorId="443EF18E">
+            <wp:anchor behindDoc="1" distT="0" distB="0" distL="0" distR="0" simplePos="0" locked="0" layoutInCell="1" allowOverlap="1" relativeHeight="115" wp14:anchorId="443EF18E">
               <wp:simplePos x="0" y="0"/>
               <wp:positionH relativeFrom="column">
                 <wp:posOffset>-23495</wp:posOffset>
@@ -15995,7 +15915,7 @@
               <wp:extent cx="5756910" cy="635"/>
               <wp:effectExtent l="635" t="3175" r="0" b="3175"/>
               <wp:wrapNone/>
-              <wp:docPr id="7" name="Straight Connector 2"/>
+              <wp:docPr id="23" name="Straight Connector 2"/>
               <a:graphic xmlns:a="http://schemas.openxmlformats.org/drawingml/2006/main">
                 <a:graphicData uri="http://schemas.microsoft.com/office/word/2010/wordprocessingShape">
                   <wps:wsp>

</xml_diff>